<commit_message>
Implementa correcao nas contas dos IPS
</commit_message>
<xml_diff>
--- a/relatorio_RCD_1F_Grupo9.docx
+++ b/relatorio_RCD_1F_Grupo9.docx
@@ -950,7 +950,7 @@
           <w:noProof/>
         </w:rPr>
         <w:drawing>
-          <wp:anchor distT="0" distB="0" distL="114300" distR="114300" simplePos="0" relativeHeight="251659264" behindDoc="1" locked="0" layoutInCell="1" allowOverlap="1" wp14:anchorId="67E89F69" wp14:editId="20D92E90">
+          <wp:anchor distT="0" distB="0" distL="114300" distR="114300" simplePos="0" relativeHeight="251659264" behindDoc="1" locked="0" layoutInCell="1" allowOverlap="1" wp14:anchorId="67E89F69" wp14:editId="2A895890">
             <wp:simplePos x="0" y="0"/>
             <wp:positionH relativeFrom="margin">
               <wp:align>center</wp:align>
@@ -3281,145 +3281,6 @@
     </w:tbl>
     <w:p/>
     <w:p>
-      <w:pPr>
-        <w:spacing w:before="60" w:after="100"/>
-      </w:pPr>
-      <w:r>
-        <w:rPr>
-          <w:color w:val="444444"/>
-          <w:sz w:val="20"/>
-          <w:szCs w:val="20"/>
-        </w:rPr>
-        <w:t xml:space="preserve">Nota: Quiosque precisa de 38 </w:t>
-      </w:r>
-      <w:proofErr w:type="spellStart"/>
-      <w:r>
-        <w:rPr>
-          <w:color w:val="444444"/>
-          <w:sz w:val="20"/>
-          <w:szCs w:val="20"/>
-        </w:rPr>
-        <w:t>hosts</w:t>
-      </w:r>
-      <w:proofErr w:type="spellEnd"/>
-      <w:r>
-        <w:rPr>
-          <w:color w:val="444444"/>
-          <w:sz w:val="20"/>
-          <w:szCs w:val="20"/>
-        </w:rPr>
-        <w:t xml:space="preserve"> → 2⁶=64 (62 utilizáveis) → /26. </w:t>
-      </w:r>
-      <w:proofErr w:type="spellStart"/>
-      <w:r>
-        <w:rPr>
-          <w:color w:val="444444"/>
-          <w:sz w:val="20"/>
-          <w:szCs w:val="20"/>
-        </w:rPr>
-        <w:t>Guest</w:t>
-      </w:r>
-      <w:proofErr w:type="spellEnd"/>
-      <w:r>
-        <w:rPr>
-          <w:color w:val="444444"/>
-          <w:sz w:val="20"/>
-          <w:szCs w:val="20"/>
-        </w:rPr>
-        <w:t xml:space="preserve"> e </w:t>
-      </w:r>
-      <w:proofErr w:type="spellStart"/>
-      <w:r>
-        <w:rPr>
-          <w:color w:val="444444"/>
-          <w:sz w:val="20"/>
-          <w:szCs w:val="20"/>
-        </w:rPr>
-        <w:t>IoT</w:t>
-      </w:r>
-      <w:proofErr w:type="spellEnd"/>
-      <w:r>
-        <w:rPr>
-          <w:color w:val="444444"/>
-          <w:sz w:val="20"/>
-          <w:szCs w:val="20"/>
-        </w:rPr>
-        <w:t xml:space="preserve"> precisam de 28 e 24 </w:t>
-      </w:r>
-      <w:proofErr w:type="spellStart"/>
-      <w:r>
-        <w:rPr>
-          <w:color w:val="444444"/>
-          <w:sz w:val="20"/>
-          <w:szCs w:val="20"/>
-        </w:rPr>
-        <w:t>hosts</w:t>
-      </w:r>
-      <w:proofErr w:type="spellEnd"/>
-      <w:r>
-        <w:rPr>
-          <w:color w:val="444444"/>
-          <w:sz w:val="20"/>
-          <w:szCs w:val="20"/>
-        </w:rPr>
-        <w:t xml:space="preserve"> respetivamente → ambas 2⁵=32 → /27. Servers com 15 </w:t>
-      </w:r>
-      <w:proofErr w:type="spellStart"/>
-      <w:r>
-        <w:rPr>
-          <w:color w:val="444444"/>
-          <w:sz w:val="20"/>
-          <w:szCs w:val="20"/>
-        </w:rPr>
-        <w:t>hosts</w:t>
-      </w:r>
-      <w:proofErr w:type="spellEnd"/>
-      <w:r>
-        <w:rPr>
-          <w:color w:val="444444"/>
-          <w:sz w:val="20"/>
-          <w:szCs w:val="20"/>
-        </w:rPr>
-        <w:t xml:space="preserve"> → 2⁵=32 → /27. </w:t>
-      </w:r>
-      <w:proofErr w:type="spellStart"/>
-      <w:r>
-        <w:rPr>
-          <w:color w:val="444444"/>
-          <w:sz w:val="20"/>
-          <w:szCs w:val="20"/>
-        </w:rPr>
-        <w:t>Printers</w:t>
-      </w:r>
-      <w:proofErr w:type="spellEnd"/>
-      <w:r>
-        <w:rPr>
-          <w:color w:val="444444"/>
-          <w:sz w:val="20"/>
-          <w:szCs w:val="20"/>
-        </w:rPr>
-        <w:t xml:space="preserve"> e Management com 7 </w:t>
-      </w:r>
-      <w:proofErr w:type="spellStart"/>
-      <w:r>
-        <w:rPr>
-          <w:color w:val="444444"/>
-          <w:sz w:val="20"/>
-          <w:szCs w:val="20"/>
-        </w:rPr>
-        <w:t>hosts</w:t>
-      </w:r>
-      <w:proofErr w:type="spellEnd"/>
-      <w:r>
-        <w:rPr>
-          <w:color w:val="444444"/>
-          <w:sz w:val="20"/>
-          <w:szCs w:val="20"/>
-        </w:rPr>
-        <w:t xml:space="preserve"> cada → 2⁴=16 → /28. Total usado: 64+32+32+32+16+16 = 192 de 256 endereços.</w:t>
-      </w:r>
-    </w:p>
-    <w:p>
       <w:r>
         <w:br w:type="page"/>
       </w:r>
@@ -6520,13 +6381,8 @@
         <w:lastRenderedPageBreak/>
         <w:t>2.3. Covilhã — Sub-redes (10.30.9.0/24)</w:t>
       </w:r>
-      <w:proofErr w:type="gramStart"/>
-      <w:r>
-        <w:t xml:space="preserve">   (</w:t>
-      </w:r>
-      <w:proofErr w:type="gramEnd"/>
-      <w:r>
-        <w:t>CORRIGIR AQUI)</w:t>
+      <w:r>
+        <w:t xml:space="preserve">  </w:t>
       </w:r>
     </w:p>
     <w:p>
@@ -6588,13 +6444,13 @@
       <w:tblGrid>
         <w:gridCol w:w="1395"/>
         <w:gridCol w:w="758"/>
-        <w:gridCol w:w="891"/>
-        <w:gridCol w:w="891"/>
-        <w:gridCol w:w="2162"/>
-        <w:gridCol w:w="1575"/>
-        <w:gridCol w:w="1575"/>
-        <w:gridCol w:w="1575"/>
-        <w:gridCol w:w="1538"/>
+        <w:gridCol w:w="890"/>
+        <w:gridCol w:w="897"/>
+        <w:gridCol w:w="2161"/>
+        <w:gridCol w:w="1574"/>
+        <w:gridCol w:w="1574"/>
+        <w:gridCol w:w="1574"/>
+        <w:gridCol w:w="1537"/>
       </w:tblGrid>
       <w:tr>
         <w:trPr>
@@ -7169,7 +7025,15 @@
                 <w:sz w:val="19"/>
                 <w:szCs w:val="19"/>
               </w:rPr>
-              <w:t>10.30.9.62</w:t>
+              <w:t>10.30.9.6</w:t>
+            </w:r>
+            <w:r>
+              <w:rPr>
+                <w:color w:val="000000"/>
+                <w:sz w:val="19"/>
+                <w:szCs w:val="19"/>
+              </w:rPr>
+              <w:t>3</w:t>
             </w:r>
           </w:p>
         </w:tc>
@@ -7432,7 +7296,15 @@
                 <w:sz w:val="19"/>
                 <w:szCs w:val="19"/>
               </w:rPr>
-              <w:t>10.30.9.126</w:t>
+              <w:t>10.30.9.12</w:t>
+            </w:r>
+            <w:r>
+              <w:rPr>
+                <w:color w:val="000000"/>
+                <w:sz w:val="19"/>
+                <w:szCs w:val="19"/>
+              </w:rPr>
+              <w:t>7</w:t>
             </w:r>
           </w:p>
         </w:tc>
@@ -7579,7 +7451,31 @@
                 <w:sz w:val="19"/>
                 <w:szCs w:val="19"/>
               </w:rPr>
-              <w:t>2⁵=32</w:t>
+              <w:t>2</w:t>
+            </w:r>
+            <w:r>
+              <w:rPr>
+                <w:color w:val="000000"/>
+                <w:sz w:val="19"/>
+                <w:szCs w:val="19"/>
+              </w:rPr>
+              <w:t>^6</w:t>
+            </w:r>
+            <w:r>
+              <w:rPr>
+                <w:color w:val="000000"/>
+                <w:sz w:val="19"/>
+                <w:szCs w:val="19"/>
+              </w:rPr>
+              <w:t>=</w:t>
+            </w:r>
+            <w:r>
+              <w:rPr>
+                <w:color w:val="000000"/>
+                <w:sz w:val="19"/>
+                <w:szCs w:val="19"/>
+              </w:rPr>
+              <w:t>64</w:t>
             </w:r>
           </w:p>
         </w:tc>
@@ -7608,7 +7504,31 @@
                 <w:sz w:val="19"/>
                 <w:szCs w:val="19"/>
               </w:rPr>
-              <w:t>/27 — 255.255.255.224</w:t>
+              <w:t>/2</w:t>
+            </w:r>
+            <w:r>
+              <w:rPr>
+                <w:color w:val="000000"/>
+                <w:sz w:val="19"/>
+                <w:szCs w:val="19"/>
+              </w:rPr>
+              <w:t>6</w:t>
+            </w:r>
+            <w:r>
+              <w:rPr>
+                <w:color w:val="000000"/>
+                <w:sz w:val="19"/>
+                <w:szCs w:val="19"/>
+              </w:rPr>
+              <w:t xml:space="preserve"> — 255.255.255.</w:t>
+            </w:r>
+            <w:r>
+              <w:rPr>
+                <w:color w:val="000000"/>
+                <w:sz w:val="19"/>
+                <w:szCs w:val="19"/>
+              </w:rPr>
+              <w:t>192</w:t>
             </w:r>
           </w:p>
         </w:tc>
@@ -7695,7 +7615,15 @@
                 <w:sz w:val="19"/>
                 <w:szCs w:val="19"/>
               </w:rPr>
-              <w:t>10.30.9.158</w:t>
+              <w:t>10.30.9.</w:t>
+            </w:r>
+            <w:r>
+              <w:rPr>
+                <w:color w:val="000000"/>
+                <w:sz w:val="19"/>
+                <w:szCs w:val="19"/>
+              </w:rPr>
+              <w:t>191</w:t>
             </w:r>
           </w:p>
         </w:tc>
@@ -7900,7 +7828,15 @@
                 <w:sz w:val="19"/>
                 <w:szCs w:val="19"/>
               </w:rPr>
-              <w:t>10.30.9.160</w:t>
+              <w:t>10.30.9.1</w:t>
+            </w:r>
+            <w:r>
+              <w:rPr>
+                <w:color w:val="000000"/>
+                <w:sz w:val="19"/>
+                <w:szCs w:val="19"/>
+              </w:rPr>
+              <w:t>92</w:t>
             </w:r>
           </w:p>
         </w:tc>
@@ -7929,7 +7865,15 @@
                 <w:sz w:val="19"/>
                 <w:szCs w:val="19"/>
               </w:rPr>
-              <w:t>10.30.9.161</w:t>
+              <w:t>10.30.9.1</w:t>
+            </w:r>
+            <w:r>
+              <w:rPr>
+                <w:color w:val="000000"/>
+                <w:sz w:val="19"/>
+                <w:szCs w:val="19"/>
+              </w:rPr>
+              <w:t>93</w:t>
             </w:r>
           </w:p>
         </w:tc>
@@ -7958,7 +7902,15 @@
                 <w:sz w:val="19"/>
                 <w:szCs w:val="19"/>
               </w:rPr>
-              <w:t>10.30.9.190</w:t>
+              <w:t>10.30.9.</w:t>
+            </w:r>
+            <w:r>
+              <w:rPr>
+                <w:color w:val="000000"/>
+                <w:sz w:val="19"/>
+                <w:szCs w:val="19"/>
+              </w:rPr>
+              <w:t>223</w:t>
             </w:r>
           </w:p>
         </w:tc>
@@ -8165,7 +8117,15 @@
                 <w:sz w:val="19"/>
                 <w:szCs w:val="19"/>
               </w:rPr>
-              <w:t>10.30.9.192</w:t>
+              <w:t>10.30.9.</w:t>
+            </w:r>
+            <w:r>
+              <w:rPr>
+                <w:color w:val="000000"/>
+                <w:sz w:val="19"/>
+                <w:szCs w:val="19"/>
+              </w:rPr>
+              <w:t>224</w:t>
             </w:r>
           </w:p>
         </w:tc>
@@ -8194,7 +8154,15 @@
                 <w:sz w:val="19"/>
                 <w:szCs w:val="19"/>
               </w:rPr>
-              <w:t>10.30.9.193</w:t>
+              <w:t>10.30.9.</w:t>
+            </w:r>
+            <w:r>
+              <w:rPr>
+                <w:color w:val="000000"/>
+                <w:sz w:val="19"/>
+                <w:szCs w:val="19"/>
+              </w:rPr>
+              <w:t>225</w:t>
             </w:r>
           </w:p>
         </w:tc>
@@ -8223,7 +8191,15 @@
                 <w:sz w:val="19"/>
                 <w:szCs w:val="19"/>
               </w:rPr>
-              <w:t>10.30.9.206</w:t>
+              <w:t>10.30.9.2</w:t>
+            </w:r>
+            <w:r>
+              <w:rPr>
+                <w:color w:val="000000"/>
+                <w:sz w:val="19"/>
+                <w:szCs w:val="19"/>
+              </w:rPr>
+              <w:t>39</w:t>
             </w:r>
           </w:p>
         </w:tc>
@@ -8430,7 +8406,15 @@
                 <w:sz w:val="19"/>
                 <w:szCs w:val="19"/>
               </w:rPr>
-              <w:t>10.30.9.208</w:t>
+              <w:t>10.30.9.2</w:t>
+            </w:r>
+            <w:r>
+              <w:rPr>
+                <w:color w:val="000000"/>
+                <w:sz w:val="19"/>
+                <w:szCs w:val="19"/>
+              </w:rPr>
+              <w:t>40</w:t>
             </w:r>
           </w:p>
         </w:tc>
@@ -8459,7 +8443,15 @@
                 <w:sz w:val="19"/>
                 <w:szCs w:val="19"/>
               </w:rPr>
-              <w:t>10.30.9.209</w:t>
+              <w:t>10.30.9.2</w:t>
+            </w:r>
+            <w:r>
+              <w:rPr>
+                <w:color w:val="000000"/>
+                <w:sz w:val="19"/>
+                <w:szCs w:val="19"/>
+              </w:rPr>
+              <w:t>41</w:t>
             </w:r>
           </w:p>
         </w:tc>
@@ -8488,7 +8480,15 @@
                 <w:sz w:val="19"/>
                 <w:szCs w:val="19"/>
               </w:rPr>
-              <w:t>10.30.9.222</w:t>
+              <w:t>10.30.9.2</w:t>
+            </w:r>
+            <w:r>
+              <w:rPr>
+                <w:color w:val="000000"/>
+                <w:sz w:val="19"/>
+                <w:szCs w:val="19"/>
+              </w:rPr>
+              <w:t>55</w:t>
             </w:r>
           </w:p>
         </w:tc>
@@ -8524,163 +8524,6 @@
       </w:tr>
     </w:tbl>
     <w:p/>
-    <w:p>
-      <w:pPr>
-        <w:spacing w:before="60" w:after="100"/>
-      </w:pPr>
-      <w:r>
-        <w:rPr>
-          <w:color w:val="444444"/>
-          <w:sz w:val="20"/>
-          <w:szCs w:val="20"/>
-        </w:rPr>
-        <w:t xml:space="preserve">Nota: </w:t>
-      </w:r>
-      <w:proofErr w:type="spellStart"/>
-      <w:r>
-        <w:rPr>
-          <w:color w:val="444444"/>
-          <w:sz w:val="20"/>
-          <w:szCs w:val="20"/>
-        </w:rPr>
-        <w:t>Guest</w:t>
-      </w:r>
-      <w:proofErr w:type="spellEnd"/>
-      <w:r>
-        <w:rPr>
-          <w:color w:val="444444"/>
-          <w:sz w:val="20"/>
-          <w:szCs w:val="20"/>
-        </w:rPr>
-        <w:t xml:space="preserve"> e Management com 33 </w:t>
-      </w:r>
-      <w:proofErr w:type="spellStart"/>
-      <w:r>
-        <w:rPr>
-          <w:color w:val="444444"/>
-          <w:sz w:val="20"/>
-          <w:szCs w:val="20"/>
-        </w:rPr>
-        <w:t>hosts</w:t>
-      </w:r>
-      <w:proofErr w:type="spellEnd"/>
-      <w:r>
-        <w:rPr>
-          <w:color w:val="444444"/>
-          <w:sz w:val="20"/>
-          <w:szCs w:val="20"/>
-        </w:rPr>
-        <w:t xml:space="preserve"> → 2⁶=64 → /26. Servers com 31 </w:t>
-      </w:r>
-      <w:proofErr w:type="spellStart"/>
-      <w:r>
-        <w:rPr>
-          <w:color w:val="444444"/>
-          <w:sz w:val="20"/>
-          <w:szCs w:val="20"/>
-        </w:rPr>
-        <w:t>hosts</w:t>
-      </w:r>
-      <w:proofErr w:type="spellEnd"/>
-      <w:r>
-        <w:rPr>
-          <w:color w:val="444444"/>
-          <w:sz w:val="20"/>
-          <w:szCs w:val="20"/>
-        </w:rPr>
-        <w:t xml:space="preserve"> → 2⁵=32 → /27. SOC com 15 </w:t>
-      </w:r>
-      <w:proofErr w:type="spellStart"/>
-      <w:r>
-        <w:rPr>
-          <w:color w:val="444444"/>
-          <w:sz w:val="20"/>
-          <w:szCs w:val="20"/>
-        </w:rPr>
-        <w:t>hosts</w:t>
-      </w:r>
-      <w:proofErr w:type="spellEnd"/>
-      <w:r>
-        <w:rPr>
-          <w:color w:val="444444"/>
-          <w:sz w:val="20"/>
-          <w:szCs w:val="20"/>
-        </w:rPr>
-        <w:t xml:space="preserve"> → 2⁵=32 → /27. </w:t>
-      </w:r>
-      <w:proofErr w:type="spellStart"/>
-      <w:r>
-        <w:rPr>
-          <w:color w:val="444444"/>
-          <w:sz w:val="20"/>
-          <w:szCs w:val="20"/>
-        </w:rPr>
-        <w:t>Security</w:t>
-      </w:r>
-      <w:proofErr w:type="spellEnd"/>
-      <w:r>
-        <w:rPr>
-          <w:color w:val="444444"/>
-          <w:sz w:val="20"/>
-          <w:szCs w:val="20"/>
-        </w:rPr>
-        <w:t xml:space="preserve"> com 12 </w:t>
-      </w:r>
-      <w:proofErr w:type="spellStart"/>
-      <w:r>
-        <w:rPr>
-          <w:color w:val="444444"/>
-          <w:sz w:val="20"/>
-          <w:szCs w:val="20"/>
-        </w:rPr>
-        <w:t>hosts</w:t>
-      </w:r>
-      <w:proofErr w:type="spellEnd"/>
-      <w:r>
-        <w:rPr>
-          <w:color w:val="444444"/>
-          <w:sz w:val="20"/>
-          <w:szCs w:val="20"/>
-        </w:rPr>
-        <w:t xml:space="preserve"> → 2⁴=16 → /28. </w:t>
-      </w:r>
-      <w:proofErr w:type="spellStart"/>
-      <w:r>
-        <w:rPr>
-          <w:color w:val="444444"/>
-          <w:sz w:val="20"/>
-          <w:szCs w:val="20"/>
-        </w:rPr>
-        <w:t>Printers</w:t>
-      </w:r>
-      <w:proofErr w:type="spellEnd"/>
-      <w:r>
-        <w:rPr>
-          <w:color w:val="444444"/>
-          <w:sz w:val="20"/>
-          <w:szCs w:val="20"/>
-        </w:rPr>
-        <w:t xml:space="preserve"> com 9 </w:t>
-      </w:r>
-      <w:proofErr w:type="spellStart"/>
-      <w:r>
-        <w:rPr>
-          <w:color w:val="444444"/>
-          <w:sz w:val="20"/>
-          <w:szCs w:val="20"/>
-        </w:rPr>
-        <w:t>hosts</w:t>
-      </w:r>
-      <w:proofErr w:type="spellEnd"/>
-      <w:r>
-        <w:rPr>
-          <w:color w:val="444444"/>
-          <w:sz w:val="20"/>
-          <w:szCs w:val="20"/>
-        </w:rPr>
-        <w:t xml:space="preserve"> → 2⁴=16 → /28. Total usado: 64+64+32+32+16+16 = 224 de 256 endereços.</w:t>
-      </w:r>
-    </w:p>
     <w:p>
       <w:r>
         <w:br w:type="page"/>
@@ -8693,9 +8536,6 @@
       <w:r>
         <w:lastRenderedPageBreak/>
         <w:t>2.4. Covilhã — Tabela de Endereçamento IP</w:t>
-      </w:r>
-      <w:r>
-        <w:t xml:space="preserve"> (CORRIGIR AQUI)</w:t>
       </w:r>
     </w:p>
     <w:p>
@@ -12817,28 +12657,10 @@
         </w:rPr>
         <w:br/>
       </w:r>
-      <w:r>
-        <w:rPr>
-          <w:color w:val="000000"/>
-        </w:rPr>
-        <w:br/>
-        <w:t>Link de como preenchemos as tabelas:</w:t>
-      </w:r>
-      <w:r>
-        <w:t xml:space="preserve"> </w:t>
-      </w:r>
-      <w:hyperlink r:id="rId9" w:history="1">
-        <w:r>
-          <w:rPr>
-            <w:rStyle w:val="Hiperligao"/>
-          </w:rPr>
-          <w:t>https://onedrive.live.com/:x:/g/personal/64c276b5e6db3235/IQCa5o59vGVOQKPmVvjR_swOAZkvOx6z0sYFai8qhG__2sE?rtime=x-GiaVuW3kg&amp;redeem=aHR0cHM6Ly8xZHJ2Lm1zL3gvYy82NGMyNzZiNWU2ZGIzMjM1L0lRQ2E1bzU5dkdWT1FLUG1WdmpSX3N3T0Faa3ZPeDZ6MHNZRmFpOHFoR19fMnNFP2U9UEw0YnY3</w:t>
-        </w:r>
-      </w:hyperlink>
     </w:p>
     <w:sectPr>
-      <w:headerReference w:type="default" r:id="rId10"/>
-      <w:footerReference w:type="default" r:id="rId11"/>
+      <w:headerReference w:type="default" r:id="rId9"/>
+      <w:footerReference w:type="default" r:id="rId10"/>
       <w:pgSz w:w="11906" w:h="16838"/>
       <w:pgMar w:top="1440" w:right="1080" w:bottom="1440" w:left="1080" w:header="708" w:footer="708" w:gutter="0"/>
       <w:cols w:space="720"/>

</xml_diff>

<commit_message>
Implementa 5 todo e relatorio
</commit_message>
<xml_diff>
--- a/relatorio_RCD_1F_Grupo9.docx
+++ b/relatorio_RCD_1F_Grupo9.docx
@@ -553,7 +553,7 @@
           <w:noProof/>
         </w:rPr>
         <w:drawing>
-          <wp:anchor distT="0" distB="0" distL="114300" distR="114300" simplePos="0" relativeHeight="251659264" behindDoc="1" locked="0" layoutInCell="1" allowOverlap="1" wp14:anchorId="67E89F69" wp14:editId="33E96EC9">
+          <wp:anchor distT="0" distB="0" distL="114300" distR="114300" simplePos="0" relativeHeight="251659264" behindDoc="1" locked="0" layoutInCell="1" allowOverlap="1" wp14:anchorId="67E89F69" wp14:editId="47D59AE1">
             <wp:simplePos x="0" y="0"/>
             <wp:positionH relativeFrom="margin">
               <wp:align>center</wp:align>
@@ -11538,18 +11538,8 @@
           <w:szCs w:val="22"/>
           <w:lang w:val="en-US"/>
         </w:rPr>
-        <w:t xml:space="preserve"> AVR-AP4 — para a rede </w:t>
-      </w:r>
-      <w:proofErr w:type="gramStart"/>
-      <w:r>
-        <w:rPr>
-          <w:sz w:val="22"/>
-          <w:szCs w:val="22"/>
-          <w:lang w:val="en-US"/>
-        </w:rPr>
-        <w:t>wireless;</w:t>
-      </w:r>
-      <w:proofErr w:type="gramEnd"/>
+        <w:t xml:space="preserve"> AVR-AP4 — para a rede wireless;</w:t>
+      </w:r>
     </w:p>
     <w:p>
       <w:pPr>
@@ -11745,18 +11735,8 @@
           <w:szCs w:val="22"/>
           <w:lang w:val="en-US"/>
         </w:rPr>
-        <w:t xml:space="preserve">Access Point: CVL-AP1 — para a rede </w:t>
-      </w:r>
-      <w:proofErr w:type="gramStart"/>
-      <w:r>
-        <w:rPr>
-          <w:sz w:val="22"/>
-          <w:szCs w:val="22"/>
-          <w:lang w:val="en-US"/>
-        </w:rPr>
-        <w:t>wireless;</w:t>
-      </w:r>
-      <w:proofErr w:type="gramEnd"/>
+        <w:t>Access Point: CVL-AP1 — para a rede wireless;</w:t>
+      </w:r>
     </w:p>
     <w:p>
       <w:pPr>
@@ -11833,24 +11813,3626 @@
     </w:p>
     <w:p>
       <w:pPr>
-        <w:spacing w:before="80" w:after="80"/>
-      </w:pPr>
-      <w:r>
-        <w:rPr>
+        <w:pStyle w:val="Ttulo2"/>
+        <w:rPr>
+          <w:color w:val="215E99" w:themeColor="text2" w:themeTint="BF"/>
+        </w:rPr>
+      </w:pPr>
+      <w:r>
+        <w:rPr>
+          <w:color w:val="215E99" w:themeColor="text2" w:themeTint="BF"/>
+        </w:rPr>
+        <w:t>5.1. Configurações Básicas dos Equipamentos</w:t>
+      </w:r>
+    </w:p>
+    <w:p>
+      <w:pPr>
+        <w:pStyle w:val="Ttulo2"/>
+        <w:rPr>
+          <w:color w:val="215E99" w:themeColor="text2" w:themeTint="BF"/>
+        </w:rPr>
+      </w:pPr>
+      <w:r>
+        <w:rPr>
+          <w:color w:val="215E99" w:themeColor="text2" w:themeTint="BF"/>
+        </w:rPr>
+        <w:t>Routers:</w:t>
+      </w:r>
+    </w:p>
+    <w:p>
+      <w:pPr>
+        <w:pStyle w:val="Ttulo2"/>
+      </w:pPr>
+      <w:r>
+        <w:drawing>
+          <wp:inline distT="0" distB="0" distL="0" distR="0" wp14:anchorId="290F7D4A" wp14:editId="2EC02D63">
+            <wp:extent cx="6188710" cy="3463290"/>
+            <wp:effectExtent l="0" t="0" r="2540" b="3810"/>
+            <wp:docPr id="806722216" name="Imagem 1"/>
+            <wp:cNvGraphicFramePr>
+              <a:graphicFrameLocks xmlns:a="http://schemas.openxmlformats.org/drawingml/2006/main" noChangeAspect="1"/>
+            </wp:cNvGraphicFramePr>
+            <a:graphic xmlns:a="http://schemas.openxmlformats.org/drawingml/2006/main">
+              <a:graphicData uri="http://schemas.openxmlformats.org/drawingml/2006/picture">
+                <pic:pic xmlns:pic="http://schemas.openxmlformats.org/drawingml/2006/picture">
+                  <pic:nvPicPr>
+                    <pic:cNvPr id="806722216" name=""/>
+                    <pic:cNvPicPr/>
+                  </pic:nvPicPr>
+                  <pic:blipFill>
+                    <a:blip r:embed="rId9"/>
+                    <a:stretch>
+                      <a:fillRect/>
+                    </a:stretch>
+                  </pic:blipFill>
+                  <pic:spPr>
+                    <a:xfrm>
+                      <a:off x="0" y="0"/>
+                      <a:ext cx="6188710" cy="3463290"/>
+                    </a:xfrm>
+                    <a:prstGeom prst="rect">
+                      <a:avLst/>
+                    </a:prstGeom>
+                  </pic:spPr>
+                </pic:pic>
+              </a:graphicData>
+            </a:graphic>
+          </wp:inline>
+        </w:drawing>
+      </w:r>
+    </w:p>
+    <w:p>
+      <w:pPr>
+        <w:pStyle w:val="Ttulo2"/>
+      </w:pPr>
+      <w:r>
+        <w:drawing>
+          <wp:inline distT="0" distB="0" distL="0" distR="0" wp14:anchorId="2838109C" wp14:editId="7D65CC81">
+            <wp:extent cx="6240780" cy="3916679"/>
+            <wp:effectExtent l="0" t="0" r="7620" b="8255"/>
+            <wp:docPr id="2017663962" name="Imagem 1"/>
+            <wp:cNvGraphicFramePr>
+              <a:graphicFrameLocks xmlns:a="http://schemas.openxmlformats.org/drawingml/2006/main" noChangeAspect="1"/>
+            </wp:cNvGraphicFramePr>
+            <a:graphic xmlns:a="http://schemas.openxmlformats.org/drawingml/2006/main">
+              <a:graphicData uri="http://schemas.openxmlformats.org/drawingml/2006/picture">
+                <pic:pic xmlns:pic="http://schemas.openxmlformats.org/drawingml/2006/picture">
+                  <pic:nvPicPr>
+                    <pic:cNvPr id="2017663962" name=""/>
+                    <pic:cNvPicPr/>
+                  </pic:nvPicPr>
+                  <pic:blipFill>
+                    <a:blip r:embed="rId10"/>
+                    <a:stretch>
+                      <a:fillRect/>
+                    </a:stretch>
+                  </pic:blipFill>
+                  <pic:spPr>
+                    <a:xfrm>
+                      <a:off x="0" y="0"/>
+                      <a:ext cx="6248398" cy="3921460"/>
+                    </a:xfrm>
+                    <a:prstGeom prst="rect">
+                      <a:avLst/>
+                    </a:prstGeom>
+                  </pic:spPr>
+                </pic:pic>
+              </a:graphicData>
+            </a:graphic>
+          </wp:inline>
+        </w:drawing>
+      </w:r>
+    </w:p>
+    <w:p>
+      <w:pPr>
+        <w:pStyle w:val="Ttulo2"/>
+      </w:pPr>
+      <w:proofErr w:type="spellStart"/>
+      <w:r>
+        <w:lastRenderedPageBreak/>
+        <w:t>Switches</w:t>
+      </w:r>
+      <w:proofErr w:type="spellEnd"/>
+      <w:r>
+        <w:t>:</w:t>
+      </w:r>
+    </w:p>
+    <w:p>
+      <w:pPr>
+        <w:pStyle w:val="Ttulo2"/>
+      </w:pPr>
+      <w:r>
+        <w:drawing>
+          <wp:inline distT="0" distB="0" distL="0" distR="0" wp14:anchorId="688367E7" wp14:editId="7B6C28D8">
+            <wp:extent cx="6188710" cy="3652520"/>
+            <wp:effectExtent l="0" t="0" r="2540" b="5080"/>
+            <wp:docPr id="634258594" name="Imagem 1"/>
+            <wp:cNvGraphicFramePr>
+              <a:graphicFrameLocks xmlns:a="http://schemas.openxmlformats.org/drawingml/2006/main" noChangeAspect="1"/>
+            </wp:cNvGraphicFramePr>
+            <a:graphic xmlns:a="http://schemas.openxmlformats.org/drawingml/2006/main">
+              <a:graphicData uri="http://schemas.openxmlformats.org/drawingml/2006/picture">
+                <pic:pic xmlns:pic="http://schemas.openxmlformats.org/drawingml/2006/picture">
+                  <pic:nvPicPr>
+                    <pic:cNvPr id="634258594" name=""/>
+                    <pic:cNvPicPr/>
+                  </pic:nvPicPr>
+                  <pic:blipFill>
+                    <a:blip r:embed="rId11"/>
+                    <a:stretch>
+                      <a:fillRect/>
+                    </a:stretch>
+                  </pic:blipFill>
+                  <pic:spPr>
+                    <a:xfrm>
+                      <a:off x="0" y="0"/>
+                      <a:ext cx="6188710" cy="3652520"/>
+                    </a:xfrm>
+                    <a:prstGeom prst="rect">
+                      <a:avLst/>
+                    </a:prstGeom>
+                  </pic:spPr>
+                </pic:pic>
+              </a:graphicData>
+            </a:graphic>
+          </wp:inline>
+        </w:drawing>
+      </w:r>
+    </w:p>
+    <w:p>
+      <w:pPr>
+        <w:pStyle w:val="Ttulo2"/>
+      </w:pPr>
+      <w:r>
+        <w:drawing>
+          <wp:inline distT="0" distB="0" distL="0" distR="0" wp14:anchorId="2292755C" wp14:editId="6DB46384">
+            <wp:extent cx="6188710" cy="4489450"/>
+            <wp:effectExtent l="0" t="0" r="2540" b="6350"/>
+            <wp:docPr id="1651296228" name="Imagem 1"/>
+            <wp:cNvGraphicFramePr>
+              <a:graphicFrameLocks xmlns:a="http://schemas.openxmlformats.org/drawingml/2006/main" noChangeAspect="1"/>
+            </wp:cNvGraphicFramePr>
+            <a:graphic xmlns:a="http://schemas.openxmlformats.org/drawingml/2006/main">
+              <a:graphicData uri="http://schemas.openxmlformats.org/drawingml/2006/picture">
+                <pic:pic xmlns:pic="http://schemas.openxmlformats.org/drawingml/2006/picture">
+                  <pic:nvPicPr>
+                    <pic:cNvPr id="1651296228" name=""/>
+                    <pic:cNvPicPr/>
+                  </pic:nvPicPr>
+                  <pic:blipFill>
+                    <a:blip r:embed="rId12"/>
+                    <a:stretch>
+                      <a:fillRect/>
+                    </a:stretch>
+                  </pic:blipFill>
+                  <pic:spPr>
+                    <a:xfrm>
+                      <a:off x="0" y="0"/>
+                      <a:ext cx="6188710" cy="4489450"/>
+                    </a:xfrm>
+                    <a:prstGeom prst="rect">
+                      <a:avLst/>
+                    </a:prstGeom>
+                  </pic:spPr>
+                </pic:pic>
+              </a:graphicData>
+            </a:graphic>
+          </wp:inline>
+        </w:drawing>
+      </w:r>
+    </w:p>
+    <w:p>
+      <w:pPr>
+        <w:pStyle w:val="Ttulo2"/>
+      </w:pPr>
+      <w:r>
+        <w:lastRenderedPageBreak/>
+        <w:t>Passwords:</w:t>
+      </w:r>
+    </w:p>
+    <w:p>
+      <w:pPr>
+        <w:pStyle w:val="Ttulo2"/>
+      </w:pPr>
+      <w:r>
+        <w:drawing>
+          <wp:inline distT="0" distB="0" distL="0" distR="0" wp14:anchorId="06E75D0E" wp14:editId="2A5310EB">
+            <wp:extent cx="6188710" cy="2343785"/>
+            <wp:effectExtent l="0" t="0" r="2540" b="0"/>
+            <wp:docPr id="150902446" name="Imagem 1"/>
+            <wp:cNvGraphicFramePr>
+              <a:graphicFrameLocks xmlns:a="http://schemas.openxmlformats.org/drawingml/2006/main" noChangeAspect="1"/>
+            </wp:cNvGraphicFramePr>
+            <a:graphic xmlns:a="http://schemas.openxmlformats.org/drawingml/2006/main">
+              <a:graphicData uri="http://schemas.openxmlformats.org/drawingml/2006/picture">
+                <pic:pic xmlns:pic="http://schemas.openxmlformats.org/drawingml/2006/picture">
+                  <pic:nvPicPr>
+                    <pic:cNvPr id="150902446" name=""/>
+                    <pic:cNvPicPr/>
+                  </pic:nvPicPr>
+                  <pic:blipFill>
+                    <a:blip r:embed="rId13"/>
+                    <a:stretch>
+                      <a:fillRect/>
+                    </a:stretch>
+                  </pic:blipFill>
+                  <pic:spPr>
+                    <a:xfrm>
+                      <a:off x="0" y="0"/>
+                      <a:ext cx="6188710" cy="2343785"/>
+                    </a:xfrm>
+                    <a:prstGeom prst="rect">
+                      <a:avLst/>
+                    </a:prstGeom>
+                  </pic:spPr>
+                </pic:pic>
+              </a:graphicData>
+            </a:graphic>
+          </wp:inline>
+        </w:drawing>
+      </w:r>
+    </w:p>
+    <w:p>
+      <w:pPr>
+        <w:pStyle w:val="Ttulo2"/>
+      </w:pPr>
+      <w:r>
+        <w:t>5.2. Configuração das Interfaces dos Routers</w:t>
+      </w:r>
+    </w:p>
+    <w:p>
+      <w:pPr>
+        <w:pStyle w:val="Ttulo2"/>
+        <w:rPr>
+          <w:b w:val="0"/>
+          <w:bCs w:val="0"/>
+          <w:color w:val="000000" w:themeColor="text1"/>
+          <w:sz w:val="22"/>
+          <w:szCs w:val="22"/>
+        </w:rPr>
+      </w:pPr>
+      <w:r>
+        <w:rPr>
+          <w:b w:val="0"/>
+          <w:bCs w:val="0"/>
+          <w:color w:val="000000" w:themeColor="text1"/>
+          <w:sz w:val="22"/>
+          <w:szCs w:val="22"/>
+        </w:rPr>
+        <w:t>Nesta etapa, procedeu-se à configuração lógica das interfaces dos routers centrais de Aveiro (AVR) e da Covilhã (CVL), seguindo rigorosamente as tabelas de endereçamento IP delineadas na Fase 1.</w:t>
+      </w:r>
+      <w:r>
+        <w:rPr>
+          <w:b w:val="0"/>
+          <w:bCs w:val="0"/>
+          <w:color w:val="000000" w:themeColor="text1"/>
+          <w:sz w:val="22"/>
+          <w:szCs w:val="22"/>
+        </w:rPr>
+        <w:t>5.3. Configuração do Servidor DHCP</w:t>
+      </w:r>
+    </w:p>
+    <w:p>
+      <w:pPr>
+        <w:pStyle w:val="Ttulo2"/>
+        <w:jc w:val="both"/>
+        <w:rPr>
+          <w:b w:val="0"/>
+          <w:bCs w:val="0"/>
+          <w:color w:val="000000" w:themeColor="text1"/>
+          <w:sz w:val="24"/>
+          <w:szCs w:val="24"/>
+        </w:rPr>
+      </w:pPr>
+      <w:r>
+        <w:rPr>
+          <w:b w:val="0"/>
+          <w:bCs w:val="0"/>
+          <w:color w:val="000000" w:themeColor="text1"/>
+          <w:sz w:val="24"/>
+          <w:szCs w:val="24"/>
+        </w:rPr>
+        <w:t>Metodologia: Router-</w:t>
+      </w:r>
+      <w:proofErr w:type="spellStart"/>
+      <w:r>
+        <w:rPr>
+          <w:b w:val="0"/>
+          <w:bCs w:val="0"/>
+          <w:color w:val="000000" w:themeColor="text1"/>
+          <w:sz w:val="24"/>
+          <w:szCs w:val="24"/>
+        </w:rPr>
+        <w:t>on</w:t>
+      </w:r>
+      <w:proofErr w:type="spellEnd"/>
+      <w:r>
+        <w:rPr>
+          <w:b w:val="0"/>
+          <w:bCs w:val="0"/>
+          <w:color w:val="000000" w:themeColor="text1"/>
+          <w:sz w:val="24"/>
+          <w:szCs w:val="24"/>
+        </w:rPr>
+        <w:t>-a-Stick</w:t>
+      </w:r>
+    </w:p>
+    <w:p>
+      <w:pPr>
+        <w:pStyle w:val="Ttulo2"/>
+        <w:rPr>
+          <w:b w:val="0"/>
+          <w:bCs w:val="0"/>
+          <w:color w:val="000000" w:themeColor="text1"/>
+          <w:sz w:val="22"/>
+          <w:szCs w:val="22"/>
+        </w:rPr>
+      </w:pPr>
+      <w:r>
+        <w:rPr>
+          <w:b w:val="0"/>
+          <w:bCs w:val="0"/>
+          <w:color w:val="000000" w:themeColor="text1"/>
+          <w:sz w:val="22"/>
+          <w:szCs w:val="22"/>
+        </w:rPr>
+        <w:t xml:space="preserve">Para permitir a comunicação entre as diferentes </w:t>
+      </w:r>
+      <w:proofErr w:type="spellStart"/>
+      <w:r>
+        <w:rPr>
+          <w:b w:val="0"/>
+          <w:bCs w:val="0"/>
+          <w:color w:val="000000" w:themeColor="text1"/>
+          <w:sz w:val="22"/>
+          <w:szCs w:val="22"/>
+        </w:rPr>
+        <w:t>VLANs</w:t>
+      </w:r>
+      <w:proofErr w:type="spellEnd"/>
+      <w:r>
+        <w:rPr>
+          <w:b w:val="0"/>
+          <w:bCs w:val="0"/>
+          <w:color w:val="000000" w:themeColor="text1"/>
+          <w:sz w:val="22"/>
+          <w:szCs w:val="22"/>
+        </w:rPr>
+        <w:t xml:space="preserve"> de cada localidade (</w:t>
+      </w:r>
+      <w:proofErr w:type="spellStart"/>
+      <w:r>
+        <w:rPr>
+          <w:b w:val="0"/>
+          <w:bCs w:val="0"/>
+          <w:color w:val="000000" w:themeColor="text1"/>
+          <w:sz w:val="22"/>
+          <w:szCs w:val="22"/>
+        </w:rPr>
+        <w:t>Inter-VLAN</w:t>
+      </w:r>
+      <w:proofErr w:type="spellEnd"/>
+      <w:r>
+        <w:rPr>
+          <w:b w:val="0"/>
+          <w:bCs w:val="0"/>
+          <w:color w:val="000000" w:themeColor="text1"/>
+          <w:sz w:val="22"/>
+          <w:szCs w:val="22"/>
+        </w:rPr>
+        <w:t xml:space="preserve"> </w:t>
+      </w:r>
+      <w:proofErr w:type="spellStart"/>
+      <w:r>
+        <w:rPr>
+          <w:b w:val="0"/>
+          <w:bCs w:val="0"/>
+          <w:color w:val="000000" w:themeColor="text1"/>
+          <w:sz w:val="22"/>
+          <w:szCs w:val="22"/>
+        </w:rPr>
+        <w:t>Routing</w:t>
+      </w:r>
+      <w:proofErr w:type="spellEnd"/>
+      <w:r>
+        <w:rPr>
+          <w:b w:val="0"/>
+          <w:bCs w:val="0"/>
+          <w:color w:val="000000" w:themeColor="text1"/>
+          <w:sz w:val="22"/>
+          <w:szCs w:val="22"/>
+        </w:rPr>
+        <w:t xml:space="preserve">), utilizou-se a técnica de </w:t>
+      </w:r>
+      <w:r>
+        <w:rPr>
+          <w:b w:val="0"/>
+          <w:bCs w:val="0"/>
           <w:i/>
-          <w:color w:val="888888"/>
-          <w:sz w:val="22"/>
-          <w:szCs w:val="22"/>
-        </w:rPr>
-        <w:t>Esta secção será preenchida na segunda entrega (24 de maio de 2026).</w:t>
+          <w:iCs/>
+          <w:color w:val="000000" w:themeColor="text1"/>
+          <w:sz w:val="22"/>
+          <w:szCs w:val="22"/>
+        </w:rPr>
+        <w:t>Router-</w:t>
+      </w:r>
+      <w:proofErr w:type="spellStart"/>
+      <w:r>
+        <w:rPr>
+          <w:b w:val="0"/>
+          <w:bCs w:val="0"/>
+          <w:i/>
+          <w:iCs/>
+          <w:color w:val="000000" w:themeColor="text1"/>
+          <w:sz w:val="22"/>
+          <w:szCs w:val="22"/>
+        </w:rPr>
+        <w:t>on</w:t>
+      </w:r>
+      <w:proofErr w:type="spellEnd"/>
+      <w:r>
+        <w:rPr>
+          <w:b w:val="0"/>
+          <w:bCs w:val="0"/>
+          <w:i/>
+          <w:iCs/>
+          <w:color w:val="000000" w:themeColor="text1"/>
+          <w:sz w:val="22"/>
+          <w:szCs w:val="22"/>
+        </w:rPr>
+        <w:t>-a-Stick</w:t>
+      </w:r>
+      <w:r>
+        <w:rPr>
+          <w:b w:val="0"/>
+          <w:bCs w:val="0"/>
+          <w:color w:val="000000" w:themeColor="text1"/>
+          <w:sz w:val="22"/>
+          <w:szCs w:val="22"/>
+        </w:rPr>
+        <w:t>. Esta abordagem consiste na utilização de uma única interface física (</w:t>
+      </w:r>
+      <w:proofErr w:type="spellStart"/>
+      <w:r>
+        <w:rPr>
+          <w:b w:val="0"/>
+          <w:bCs w:val="0"/>
+          <w:color w:val="000000" w:themeColor="text1"/>
+          <w:sz w:val="22"/>
+          <w:szCs w:val="22"/>
+        </w:rPr>
+        <w:t>GigabitEthernet</w:t>
+      </w:r>
+      <w:proofErr w:type="spellEnd"/>
+      <w:r>
+        <w:rPr>
+          <w:b w:val="0"/>
+          <w:bCs w:val="0"/>
+          <w:color w:val="000000" w:themeColor="text1"/>
+          <w:sz w:val="22"/>
+          <w:szCs w:val="22"/>
+        </w:rPr>
+        <w:t xml:space="preserve"> 0/0) subdividida em múltiplas </w:t>
+      </w:r>
+      <w:proofErr w:type="spellStart"/>
+      <w:proofErr w:type="gramStart"/>
+      <w:r>
+        <w:rPr>
+          <w:b w:val="0"/>
+          <w:bCs w:val="0"/>
+          <w:color w:val="000000" w:themeColor="text1"/>
+          <w:sz w:val="22"/>
+          <w:szCs w:val="22"/>
+        </w:rPr>
+        <w:t>sub-interfaces</w:t>
+      </w:r>
+      <w:proofErr w:type="spellEnd"/>
+      <w:proofErr w:type="gramEnd"/>
+      <w:r>
+        <w:rPr>
+          <w:b w:val="0"/>
+          <w:bCs w:val="0"/>
+          <w:color w:val="000000" w:themeColor="text1"/>
+          <w:sz w:val="22"/>
+          <w:szCs w:val="22"/>
+        </w:rPr>
+        <w:t xml:space="preserve"> lógicas, uma para cada VLAN. </w:t>
       </w:r>
     </w:p>
     <w:p>
       <w:pPr>
         <w:pStyle w:val="Ttulo2"/>
-      </w:pPr>
-      <w:r>
-        <w:t>5.1. Configurações Básicas dos Equipamentos</w:t>
+        <w:rPr>
+          <w:b w:val="0"/>
+          <w:bCs w:val="0"/>
+          <w:color w:val="000000" w:themeColor="text1"/>
+          <w:sz w:val="24"/>
+          <w:szCs w:val="24"/>
+        </w:rPr>
+      </w:pPr>
+      <w:r>
+        <w:rPr>
+          <w:b w:val="0"/>
+          <w:bCs w:val="0"/>
+          <w:color w:val="000000" w:themeColor="text1"/>
+          <w:sz w:val="24"/>
+          <w:szCs w:val="24"/>
+        </w:rPr>
+        <w:t xml:space="preserve">Cada </w:t>
+      </w:r>
+      <w:proofErr w:type="spellStart"/>
+      <w:proofErr w:type="gramStart"/>
+      <w:r>
+        <w:rPr>
+          <w:b w:val="0"/>
+          <w:bCs w:val="0"/>
+          <w:color w:val="000000" w:themeColor="text1"/>
+          <w:sz w:val="24"/>
+          <w:szCs w:val="24"/>
+        </w:rPr>
+        <w:t>sub-interface</w:t>
+      </w:r>
+      <w:proofErr w:type="spellEnd"/>
+      <w:proofErr w:type="gramEnd"/>
+      <w:r>
+        <w:rPr>
+          <w:b w:val="0"/>
+          <w:bCs w:val="0"/>
+          <w:color w:val="000000" w:themeColor="text1"/>
+          <w:sz w:val="24"/>
+          <w:szCs w:val="24"/>
+        </w:rPr>
+        <w:t xml:space="preserve"> foi configurada com:</w:t>
+      </w:r>
+    </w:p>
+    <w:p>
+      <w:pPr>
+        <w:pStyle w:val="Ttulo2"/>
+        <w:numPr>
+          <w:ilvl w:val="0"/>
+          <w:numId w:val="3"/>
+        </w:numPr>
+        <w:rPr>
+          <w:b w:val="0"/>
+          <w:bCs w:val="0"/>
+          <w:color w:val="000000" w:themeColor="text1"/>
+          <w:sz w:val="22"/>
+          <w:szCs w:val="22"/>
+        </w:rPr>
+      </w:pPr>
+      <w:r>
+        <w:rPr>
+          <w:b w:val="0"/>
+          <w:bCs w:val="0"/>
+          <w:color w:val="000000" w:themeColor="text1"/>
+          <w:sz w:val="22"/>
+          <w:szCs w:val="22"/>
+        </w:rPr>
+        <w:t xml:space="preserve">Encapsulamento dot1Q: Para associar a </w:t>
+      </w:r>
+      <w:proofErr w:type="spellStart"/>
+      <w:proofErr w:type="gramStart"/>
+      <w:r>
+        <w:rPr>
+          <w:b w:val="0"/>
+          <w:bCs w:val="0"/>
+          <w:color w:val="000000" w:themeColor="text1"/>
+          <w:sz w:val="22"/>
+          <w:szCs w:val="22"/>
+        </w:rPr>
+        <w:t>sub-interface</w:t>
+      </w:r>
+      <w:proofErr w:type="spellEnd"/>
+      <w:proofErr w:type="gramEnd"/>
+      <w:r>
+        <w:rPr>
+          <w:b w:val="0"/>
+          <w:bCs w:val="0"/>
+          <w:color w:val="000000" w:themeColor="text1"/>
+          <w:sz w:val="22"/>
+          <w:szCs w:val="22"/>
+        </w:rPr>
+        <w:t xml:space="preserve"> ao ID da VLAN correspondente. </w:t>
+      </w:r>
+    </w:p>
+    <w:p>
+      <w:pPr>
+        <w:pStyle w:val="Ttulo2"/>
+        <w:numPr>
+          <w:ilvl w:val="0"/>
+          <w:numId w:val="3"/>
+        </w:numPr>
+        <w:rPr>
+          <w:b w:val="0"/>
+          <w:bCs w:val="0"/>
+          <w:color w:val="000000" w:themeColor="text1"/>
+          <w:sz w:val="22"/>
+          <w:szCs w:val="22"/>
+        </w:rPr>
+      </w:pPr>
+      <w:r>
+        <w:rPr>
+          <w:b w:val="0"/>
+          <w:bCs w:val="0"/>
+          <w:color w:val="000000" w:themeColor="text1"/>
+          <w:sz w:val="22"/>
+          <w:szCs w:val="22"/>
+        </w:rPr>
+        <w:t xml:space="preserve">Endereço IP de Gateway: Atribuição do primeiro endereço utilizável de cada sub-rede, conforme o planeamento VLSM. </w:t>
+      </w:r>
+    </w:p>
+    <w:p>
+      <w:pPr>
+        <w:pStyle w:val="Ttulo2"/>
+        <w:rPr>
+          <w:b w:val="0"/>
+          <w:bCs w:val="0"/>
+          <w:color w:val="000000" w:themeColor="text1"/>
+        </w:rPr>
+      </w:pPr>
+      <w:r>
+        <w:rPr>
+          <w:b w:val="0"/>
+          <w:bCs w:val="0"/>
+          <w:color w:val="000000" w:themeColor="text1"/>
+        </w:rPr>
+        <w:t>1. Configuração do Router AVR (Aveiro)</w:t>
+      </w:r>
+    </w:p>
+    <w:p>
+      <w:pPr>
+        <w:pStyle w:val="Ttulo2"/>
+        <w:rPr>
+          <w:b w:val="0"/>
+          <w:bCs w:val="0"/>
+          <w:color w:val="000000" w:themeColor="text1"/>
+          <w:sz w:val="22"/>
+          <w:szCs w:val="22"/>
+        </w:rPr>
+      </w:pPr>
+      <w:r>
+        <w:rPr>
+          <w:b w:val="0"/>
+          <w:bCs w:val="0"/>
+          <w:color w:val="000000" w:themeColor="text1"/>
+          <w:sz w:val="22"/>
+          <w:szCs w:val="22"/>
+        </w:rPr>
+        <w:t xml:space="preserve">O router de Aveiro assegura o encaminhamento para 6 sub-redes internas e a ligação ao ISP VOD. </w:t>
+      </w:r>
+    </w:p>
+    <w:p>
+      <w:pPr>
+        <w:pStyle w:val="Ttulo2"/>
+        <w:rPr>
+          <w:color w:val="000000" w:themeColor="text1"/>
+        </w:rPr>
+      </w:pPr>
+      <w:r>
+        <w:rPr>
+          <w:color w:val="000000" w:themeColor="text1"/>
+        </w:rPr>
+        <w:t>Interface WAN (Ligação ao ISP):</w:t>
+      </w:r>
+    </w:p>
+    <w:p>
+      <w:pPr>
+        <w:pStyle w:val="Ttulo2"/>
+        <w:rPr>
+          <w:b w:val="0"/>
+          <w:bCs w:val="0"/>
+          <w:i/>
+          <w:iCs/>
+          <w:color w:val="000000" w:themeColor="text1"/>
+          <w:sz w:val="18"/>
+          <w:szCs w:val="18"/>
+        </w:rPr>
+      </w:pPr>
+      <w:r>
+        <w:rPr>
+          <w:b w:val="0"/>
+          <w:bCs w:val="0"/>
+          <w:i/>
+          <w:iCs/>
+          <w:color w:val="000000" w:themeColor="text1"/>
+          <w:sz w:val="18"/>
+          <w:szCs w:val="18"/>
+        </w:rPr>
+        <w:t>interface Serial 0/3/0</w:t>
+      </w:r>
+    </w:p>
+    <w:p>
+      <w:pPr>
+        <w:pStyle w:val="Ttulo2"/>
+        <w:rPr>
+          <w:b w:val="0"/>
+          <w:bCs w:val="0"/>
+          <w:i/>
+          <w:iCs/>
+          <w:color w:val="000000" w:themeColor="text1"/>
+          <w:sz w:val="18"/>
+          <w:szCs w:val="18"/>
+        </w:rPr>
+      </w:pPr>
+      <w:r>
+        <w:rPr>
+          <w:b w:val="0"/>
+          <w:bCs w:val="0"/>
+          <w:i/>
+          <w:iCs/>
+          <w:color w:val="000000" w:themeColor="text1"/>
+          <w:sz w:val="18"/>
+          <w:szCs w:val="18"/>
+        </w:rPr>
+        <w:t xml:space="preserve"> </w:t>
+      </w:r>
+      <w:proofErr w:type="spellStart"/>
+      <w:r>
+        <w:rPr>
+          <w:b w:val="0"/>
+          <w:bCs w:val="0"/>
+          <w:i/>
+          <w:iCs/>
+          <w:color w:val="000000" w:themeColor="text1"/>
+          <w:sz w:val="18"/>
+          <w:szCs w:val="18"/>
+        </w:rPr>
+        <w:t>description</w:t>
+      </w:r>
+      <w:proofErr w:type="spellEnd"/>
+      <w:r>
+        <w:rPr>
+          <w:b w:val="0"/>
+          <w:bCs w:val="0"/>
+          <w:i/>
+          <w:iCs/>
+          <w:color w:val="000000" w:themeColor="text1"/>
+          <w:sz w:val="18"/>
+          <w:szCs w:val="18"/>
+        </w:rPr>
+        <w:t xml:space="preserve"> </w:t>
+      </w:r>
+      <w:proofErr w:type="spellStart"/>
+      <w:r>
+        <w:rPr>
+          <w:b w:val="0"/>
+          <w:bCs w:val="0"/>
+          <w:i/>
+          <w:iCs/>
+          <w:color w:val="000000" w:themeColor="text1"/>
+          <w:sz w:val="18"/>
+          <w:szCs w:val="18"/>
+        </w:rPr>
+        <w:t>Ligacao</w:t>
+      </w:r>
+      <w:proofErr w:type="spellEnd"/>
+      <w:r>
+        <w:rPr>
+          <w:b w:val="0"/>
+          <w:bCs w:val="0"/>
+          <w:i/>
+          <w:iCs/>
+          <w:color w:val="000000" w:themeColor="text1"/>
+          <w:sz w:val="18"/>
+          <w:szCs w:val="18"/>
+        </w:rPr>
+        <w:t xml:space="preserve"> ao ISP VOD</w:t>
+      </w:r>
+    </w:p>
+    <w:p>
+      <w:pPr>
+        <w:pStyle w:val="Ttulo2"/>
+        <w:rPr>
+          <w:b w:val="0"/>
+          <w:bCs w:val="0"/>
+          <w:i/>
+          <w:iCs/>
+          <w:color w:val="000000" w:themeColor="text1"/>
+          <w:sz w:val="18"/>
+          <w:szCs w:val="18"/>
+        </w:rPr>
+      </w:pPr>
+      <w:r>
+        <w:rPr>
+          <w:b w:val="0"/>
+          <w:bCs w:val="0"/>
+          <w:i/>
+          <w:iCs/>
+          <w:color w:val="000000" w:themeColor="text1"/>
+          <w:sz w:val="18"/>
+          <w:szCs w:val="18"/>
+        </w:rPr>
+        <w:t xml:space="preserve"> </w:t>
+      </w:r>
+      <w:proofErr w:type="spellStart"/>
+      <w:r>
+        <w:rPr>
+          <w:b w:val="0"/>
+          <w:bCs w:val="0"/>
+          <w:i/>
+          <w:iCs/>
+          <w:color w:val="000000" w:themeColor="text1"/>
+          <w:sz w:val="18"/>
+          <w:szCs w:val="18"/>
+        </w:rPr>
+        <w:t>ip</w:t>
+      </w:r>
+      <w:proofErr w:type="spellEnd"/>
+      <w:r>
+        <w:rPr>
+          <w:b w:val="0"/>
+          <w:bCs w:val="0"/>
+          <w:i/>
+          <w:iCs/>
+          <w:color w:val="000000" w:themeColor="text1"/>
+          <w:sz w:val="18"/>
+          <w:szCs w:val="18"/>
+        </w:rPr>
+        <w:t xml:space="preserve"> </w:t>
+      </w:r>
+      <w:proofErr w:type="spellStart"/>
+      <w:r>
+        <w:rPr>
+          <w:b w:val="0"/>
+          <w:bCs w:val="0"/>
+          <w:i/>
+          <w:iCs/>
+          <w:color w:val="000000" w:themeColor="text1"/>
+          <w:sz w:val="18"/>
+          <w:szCs w:val="18"/>
+        </w:rPr>
+        <w:t>address</w:t>
+      </w:r>
+      <w:proofErr w:type="spellEnd"/>
+      <w:r>
+        <w:rPr>
+          <w:b w:val="0"/>
+          <w:bCs w:val="0"/>
+          <w:i/>
+          <w:iCs/>
+          <w:color w:val="000000" w:themeColor="text1"/>
+          <w:sz w:val="18"/>
+          <w:szCs w:val="18"/>
+        </w:rPr>
+        <w:t xml:space="preserve"> 62.128.143.101 255.255.255.252</w:t>
+      </w:r>
+    </w:p>
+    <w:p>
+      <w:pPr>
+        <w:pStyle w:val="Ttulo2"/>
+        <w:rPr>
+          <w:b w:val="0"/>
+          <w:bCs w:val="0"/>
+          <w:i/>
+          <w:iCs/>
+          <w:color w:val="000000" w:themeColor="text1"/>
+          <w:sz w:val="18"/>
+          <w:szCs w:val="18"/>
+        </w:rPr>
+      </w:pPr>
+      <w:r>
+        <w:rPr>
+          <w:b w:val="0"/>
+          <w:bCs w:val="0"/>
+          <w:i/>
+          <w:iCs/>
+          <w:color w:val="000000" w:themeColor="text1"/>
+          <w:sz w:val="18"/>
+          <w:szCs w:val="18"/>
+        </w:rPr>
+        <w:t xml:space="preserve"> no </w:t>
+      </w:r>
+      <w:proofErr w:type="spellStart"/>
+      <w:r>
+        <w:rPr>
+          <w:b w:val="0"/>
+          <w:bCs w:val="0"/>
+          <w:i/>
+          <w:iCs/>
+          <w:color w:val="000000" w:themeColor="text1"/>
+          <w:sz w:val="18"/>
+          <w:szCs w:val="18"/>
+        </w:rPr>
+        <w:t>shutdown</w:t>
+      </w:r>
+      <w:proofErr w:type="spellEnd"/>
+    </w:p>
+    <w:p>
+      <w:pPr>
+        <w:pStyle w:val="Ttulo2"/>
+        <w:rPr>
+          <w:b w:val="0"/>
+          <w:bCs w:val="0"/>
+          <w:i/>
+          <w:iCs/>
+          <w:color w:val="000000" w:themeColor="text1"/>
+          <w:sz w:val="18"/>
+          <w:szCs w:val="18"/>
+        </w:rPr>
+      </w:pPr>
+    </w:p>
+    <w:p>
+      <w:pPr>
+        <w:pStyle w:val="Ttulo2"/>
+        <w:rPr>
+          <w:b w:val="0"/>
+          <w:bCs w:val="0"/>
+          <w:i/>
+          <w:iCs/>
+          <w:color w:val="000000" w:themeColor="text1"/>
+          <w:sz w:val="18"/>
+          <w:szCs w:val="18"/>
+        </w:rPr>
+      </w:pPr>
+    </w:p>
+    <w:p>
+      <w:pPr>
+        <w:pStyle w:val="Ttulo2"/>
+        <w:rPr>
+          <w:b w:val="0"/>
+          <w:bCs w:val="0"/>
+          <w:i/>
+          <w:iCs/>
+          <w:color w:val="000000" w:themeColor="text1"/>
+          <w:sz w:val="18"/>
+          <w:szCs w:val="18"/>
+        </w:rPr>
+      </w:pPr>
+    </w:p>
+    <w:p>
+      <w:pPr>
+        <w:pStyle w:val="Ttulo2"/>
+        <w:rPr>
+          <w:color w:val="215E99" w:themeColor="text2" w:themeTint="BF"/>
+        </w:rPr>
+      </w:pPr>
+      <w:r>
+        <w:rPr>
+          <w:color w:val="215E99" w:themeColor="text2" w:themeTint="BF"/>
+        </w:rPr>
+        <w:lastRenderedPageBreak/>
+        <w:t>Interfaces LAN (Exemplo para VLAN 70 - Quiosque e VLAN 160 - Servers):</w:t>
+      </w:r>
+    </w:p>
+    <w:p>
+      <w:pPr>
+        <w:pStyle w:val="Ttulo2"/>
+        <w:rPr>
+          <w:b w:val="0"/>
+          <w:bCs w:val="0"/>
+          <w:color w:val="000000" w:themeColor="text1"/>
+          <w:sz w:val="18"/>
+          <w:szCs w:val="18"/>
+        </w:rPr>
+      </w:pPr>
+      <w:r>
+        <w:rPr>
+          <w:b w:val="0"/>
+          <w:bCs w:val="0"/>
+          <w:color w:val="000000" w:themeColor="text1"/>
+          <w:sz w:val="18"/>
+          <w:szCs w:val="18"/>
+        </w:rPr>
+        <w:t xml:space="preserve">interface </w:t>
+      </w:r>
+      <w:proofErr w:type="spellStart"/>
+      <w:r>
+        <w:rPr>
+          <w:b w:val="0"/>
+          <w:bCs w:val="0"/>
+          <w:color w:val="000000" w:themeColor="text1"/>
+          <w:sz w:val="18"/>
+          <w:szCs w:val="18"/>
+        </w:rPr>
+        <w:t>GigabitEthernet</w:t>
+      </w:r>
+      <w:proofErr w:type="spellEnd"/>
+      <w:r>
+        <w:rPr>
+          <w:b w:val="0"/>
+          <w:bCs w:val="0"/>
+          <w:color w:val="000000" w:themeColor="text1"/>
+          <w:sz w:val="18"/>
+          <w:szCs w:val="18"/>
+        </w:rPr>
+        <w:t xml:space="preserve"> 0/0</w:t>
+      </w:r>
+    </w:p>
+    <w:p>
+      <w:pPr>
+        <w:pStyle w:val="Ttulo2"/>
+        <w:rPr>
+          <w:b w:val="0"/>
+          <w:bCs w:val="0"/>
+          <w:color w:val="000000" w:themeColor="text1"/>
+          <w:sz w:val="18"/>
+          <w:szCs w:val="18"/>
+        </w:rPr>
+      </w:pPr>
+      <w:r>
+        <w:rPr>
+          <w:b w:val="0"/>
+          <w:bCs w:val="0"/>
+          <w:color w:val="000000" w:themeColor="text1"/>
+          <w:sz w:val="18"/>
+          <w:szCs w:val="18"/>
+        </w:rPr>
+        <w:t xml:space="preserve"> no </w:t>
+      </w:r>
+      <w:proofErr w:type="spellStart"/>
+      <w:proofErr w:type="gramStart"/>
+      <w:r>
+        <w:rPr>
+          <w:b w:val="0"/>
+          <w:bCs w:val="0"/>
+          <w:color w:val="000000" w:themeColor="text1"/>
+          <w:sz w:val="18"/>
+          <w:szCs w:val="18"/>
+        </w:rPr>
+        <w:t>shutdown</w:t>
+      </w:r>
+      <w:proofErr w:type="spellEnd"/>
+      <w:r>
+        <w:rPr>
+          <w:b w:val="0"/>
+          <w:bCs w:val="0"/>
+          <w:color w:val="000000" w:themeColor="text1"/>
+          <w:sz w:val="18"/>
+          <w:szCs w:val="18"/>
+        </w:rPr>
+        <w:t xml:space="preserve">  !</w:t>
+      </w:r>
+      <w:proofErr w:type="gramEnd"/>
+      <w:r>
+        <w:rPr>
+          <w:b w:val="0"/>
+          <w:bCs w:val="0"/>
+          <w:color w:val="000000" w:themeColor="text1"/>
+          <w:sz w:val="18"/>
+          <w:szCs w:val="18"/>
+        </w:rPr>
+        <w:t xml:space="preserve"> Ativa a interface </w:t>
+      </w:r>
+      <w:proofErr w:type="spellStart"/>
+      <w:r>
+        <w:rPr>
+          <w:b w:val="0"/>
+          <w:bCs w:val="0"/>
+          <w:color w:val="000000" w:themeColor="text1"/>
+          <w:sz w:val="18"/>
+          <w:szCs w:val="18"/>
+        </w:rPr>
+        <w:t>fisica</w:t>
+      </w:r>
+      <w:proofErr w:type="spellEnd"/>
+      <w:r>
+        <w:rPr>
+          <w:b w:val="0"/>
+          <w:bCs w:val="0"/>
+          <w:color w:val="000000" w:themeColor="text1"/>
+          <w:sz w:val="18"/>
+          <w:szCs w:val="18"/>
+        </w:rPr>
+        <w:t xml:space="preserve"> principal</w:t>
+      </w:r>
+    </w:p>
+    <w:p>
+      <w:pPr>
+        <w:pStyle w:val="Ttulo2"/>
+        <w:rPr>
+          <w:b w:val="0"/>
+          <w:bCs w:val="0"/>
+          <w:color w:val="000000" w:themeColor="text1"/>
+          <w:sz w:val="18"/>
+          <w:szCs w:val="18"/>
+        </w:rPr>
+      </w:pPr>
+    </w:p>
+    <w:p>
+      <w:pPr>
+        <w:pStyle w:val="Ttulo2"/>
+        <w:rPr>
+          <w:b w:val="0"/>
+          <w:bCs w:val="0"/>
+          <w:color w:val="000000" w:themeColor="text1"/>
+          <w:sz w:val="18"/>
+          <w:szCs w:val="18"/>
+        </w:rPr>
+      </w:pPr>
+      <w:r>
+        <w:rPr>
+          <w:b w:val="0"/>
+          <w:bCs w:val="0"/>
+          <w:color w:val="000000" w:themeColor="text1"/>
+          <w:sz w:val="18"/>
+          <w:szCs w:val="18"/>
+        </w:rPr>
+        <w:t xml:space="preserve">interface </w:t>
+      </w:r>
+      <w:proofErr w:type="spellStart"/>
+      <w:r>
+        <w:rPr>
+          <w:b w:val="0"/>
+          <w:bCs w:val="0"/>
+          <w:color w:val="000000" w:themeColor="text1"/>
+          <w:sz w:val="18"/>
+          <w:szCs w:val="18"/>
+        </w:rPr>
+        <w:t>GigabitEthernet</w:t>
+      </w:r>
+      <w:proofErr w:type="spellEnd"/>
+      <w:r>
+        <w:rPr>
+          <w:b w:val="0"/>
+          <w:bCs w:val="0"/>
+          <w:color w:val="000000" w:themeColor="text1"/>
+          <w:sz w:val="18"/>
+          <w:szCs w:val="18"/>
+        </w:rPr>
+        <w:t xml:space="preserve"> 0/0.70</w:t>
+      </w:r>
+    </w:p>
+    <w:p>
+      <w:pPr>
+        <w:pStyle w:val="Ttulo2"/>
+        <w:rPr>
+          <w:b w:val="0"/>
+          <w:bCs w:val="0"/>
+          <w:color w:val="000000" w:themeColor="text1"/>
+          <w:sz w:val="18"/>
+          <w:szCs w:val="18"/>
+        </w:rPr>
+      </w:pPr>
+      <w:r>
+        <w:rPr>
+          <w:b w:val="0"/>
+          <w:bCs w:val="0"/>
+          <w:color w:val="000000" w:themeColor="text1"/>
+          <w:sz w:val="18"/>
+          <w:szCs w:val="18"/>
+        </w:rPr>
+        <w:t xml:space="preserve"> </w:t>
+      </w:r>
+      <w:proofErr w:type="spellStart"/>
+      <w:r>
+        <w:rPr>
+          <w:b w:val="0"/>
+          <w:bCs w:val="0"/>
+          <w:color w:val="000000" w:themeColor="text1"/>
+          <w:sz w:val="18"/>
+          <w:szCs w:val="18"/>
+        </w:rPr>
+        <w:t>description</w:t>
+      </w:r>
+      <w:proofErr w:type="spellEnd"/>
+      <w:r>
+        <w:rPr>
+          <w:b w:val="0"/>
+          <w:bCs w:val="0"/>
+          <w:color w:val="000000" w:themeColor="text1"/>
+          <w:sz w:val="18"/>
+          <w:szCs w:val="18"/>
+        </w:rPr>
+        <w:t xml:space="preserve"> Gateway VLAN 70 - Quiosque</w:t>
+      </w:r>
+    </w:p>
+    <w:p>
+      <w:pPr>
+        <w:pStyle w:val="Ttulo2"/>
+        <w:rPr>
+          <w:b w:val="0"/>
+          <w:bCs w:val="0"/>
+          <w:color w:val="000000" w:themeColor="text1"/>
+          <w:sz w:val="18"/>
+          <w:szCs w:val="18"/>
+        </w:rPr>
+      </w:pPr>
+      <w:r>
+        <w:rPr>
+          <w:b w:val="0"/>
+          <w:bCs w:val="0"/>
+          <w:color w:val="000000" w:themeColor="text1"/>
+          <w:sz w:val="18"/>
+          <w:szCs w:val="18"/>
+        </w:rPr>
+        <w:t xml:space="preserve"> </w:t>
+      </w:r>
+      <w:proofErr w:type="spellStart"/>
+      <w:r>
+        <w:rPr>
+          <w:b w:val="0"/>
+          <w:bCs w:val="0"/>
+          <w:color w:val="000000" w:themeColor="text1"/>
+          <w:sz w:val="18"/>
+          <w:szCs w:val="18"/>
+        </w:rPr>
+        <w:t>encapsulation</w:t>
+      </w:r>
+      <w:proofErr w:type="spellEnd"/>
+      <w:r>
+        <w:rPr>
+          <w:b w:val="0"/>
+          <w:bCs w:val="0"/>
+          <w:color w:val="000000" w:themeColor="text1"/>
+          <w:sz w:val="18"/>
+          <w:szCs w:val="18"/>
+        </w:rPr>
+        <w:t xml:space="preserve"> dot1Q 70</w:t>
+      </w:r>
+    </w:p>
+    <w:p>
+      <w:pPr>
+        <w:pStyle w:val="Ttulo2"/>
+        <w:rPr>
+          <w:b w:val="0"/>
+          <w:bCs w:val="0"/>
+          <w:color w:val="000000" w:themeColor="text1"/>
+          <w:sz w:val="18"/>
+          <w:szCs w:val="18"/>
+        </w:rPr>
+      </w:pPr>
+      <w:r>
+        <w:rPr>
+          <w:b w:val="0"/>
+          <w:bCs w:val="0"/>
+          <w:color w:val="000000" w:themeColor="text1"/>
+          <w:sz w:val="18"/>
+          <w:szCs w:val="18"/>
+        </w:rPr>
+        <w:t xml:space="preserve"> </w:t>
+      </w:r>
+      <w:proofErr w:type="spellStart"/>
+      <w:r>
+        <w:rPr>
+          <w:b w:val="0"/>
+          <w:bCs w:val="0"/>
+          <w:color w:val="000000" w:themeColor="text1"/>
+          <w:sz w:val="18"/>
+          <w:szCs w:val="18"/>
+        </w:rPr>
+        <w:t>ip</w:t>
+      </w:r>
+      <w:proofErr w:type="spellEnd"/>
+      <w:r>
+        <w:rPr>
+          <w:b w:val="0"/>
+          <w:bCs w:val="0"/>
+          <w:color w:val="000000" w:themeColor="text1"/>
+          <w:sz w:val="18"/>
+          <w:szCs w:val="18"/>
+        </w:rPr>
+        <w:t xml:space="preserve"> </w:t>
+      </w:r>
+      <w:proofErr w:type="spellStart"/>
+      <w:r>
+        <w:rPr>
+          <w:b w:val="0"/>
+          <w:bCs w:val="0"/>
+          <w:color w:val="000000" w:themeColor="text1"/>
+          <w:sz w:val="18"/>
+          <w:szCs w:val="18"/>
+        </w:rPr>
+        <w:t>address</w:t>
+      </w:r>
+      <w:proofErr w:type="spellEnd"/>
+      <w:r>
+        <w:rPr>
+          <w:b w:val="0"/>
+          <w:bCs w:val="0"/>
+          <w:color w:val="000000" w:themeColor="text1"/>
+          <w:sz w:val="18"/>
+          <w:szCs w:val="18"/>
+        </w:rPr>
+        <w:t xml:space="preserve"> 10.99.9.1 255.255.255.192</w:t>
+      </w:r>
+    </w:p>
+    <w:p>
+      <w:pPr>
+        <w:pStyle w:val="Ttulo2"/>
+        <w:rPr>
+          <w:b w:val="0"/>
+          <w:bCs w:val="0"/>
+          <w:color w:val="000000" w:themeColor="text1"/>
+          <w:sz w:val="18"/>
+          <w:szCs w:val="18"/>
+        </w:rPr>
+      </w:pPr>
+    </w:p>
+    <w:p>
+      <w:pPr>
+        <w:pStyle w:val="Ttulo2"/>
+        <w:rPr>
+          <w:b w:val="0"/>
+          <w:bCs w:val="0"/>
+          <w:color w:val="000000" w:themeColor="text1"/>
+          <w:sz w:val="18"/>
+          <w:szCs w:val="18"/>
+        </w:rPr>
+      </w:pPr>
+      <w:r>
+        <w:rPr>
+          <w:b w:val="0"/>
+          <w:bCs w:val="0"/>
+          <w:color w:val="000000" w:themeColor="text1"/>
+          <w:sz w:val="18"/>
+          <w:szCs w:val="18"/>
+        </w:rPr>
+        <w:t xml:space="preserve">interface </w:t>
+      </w:r>
+      <w:proofErr w:type="spellStart"/>
+      <w:r>
+        <w:rPr>
+          <w:b w:val="0"/>
+          <w:bCs w:val="0"/>
+          <w:color w:val="000000" w:themeColor="text1"/>
+          <w:sz w:val="18"/>
+          <w:szCs w:val="18"/>
+        </w:rPr>
+        <w:t>GigabitEthernet</w:t>
+      </w:r>
+      <w:proofErr w:type="spellEnd"/>
+      <w:r>
+        <w:rPr>
+          <w:b w:val="0"/>
+          <w:bCs w:val="0"/>
+          <w:color w:val="000000" w:themeColor="text1"/>
+          <w:sz w:val="18"/>
+          <w:szCs w:val="18"/>
+        </w:rPr>
+        <w:t xml:space="preserve"> 0/0.160</w:t>
+      </w:r>
+    </w:p>
+    <w:p>
+      <w:pPr>
+        <w:pStyle w:val="Ttulo2"/>
+        <w:rPr>
+          <w:b w:val="0"/>
+          <w:bCs w:val="0"/>
+          <w:color w:val="000000" w:themeColor="text1"/>
+          <w:sz w:val="18"/>
+          <w:szCs w:val="18"/>
+        </w:rPr>
+      </w:pPr>
+      <w:r>
+        <w:rPr>
+          <w:b w:val="0"/>
+          <w:bCs w:val="0"/>
+          <w:color w:val="000000" w:themeColor="text1"/>
+          <w:sz w:val="18"/>
+          <w:szCs w:val="18"/>
+        </w:rPr>
+        <w:t xml:space="preserve"> </w:t>
+      </w:r>
+      <w:proofErr w:type="spellStart"/>
+      <w:r>
+        <w:rPr>
+          <w:b w:val="0"/>
+          <w:bCs w:val="0"/>
+          <w:color w:val="000000" w:themeColor="text1"/>
+          <w:sz w:val="18"/>
+          <w:szCs w:val="18"/>
+        </w:rPr>
+        <w:t>description</w:t>
+      </w:r>
+      <w:proofErr w:type="spellEnd"/>
+      <w:r>
+        <w:rPr>
+          <w:b w:val="0"/>
+          <w:bCs w:val="0"/>
+          <w:color w:val="000000" w:themeColor="text1"/>
+          <w:sz w:val="18"/>
+          <w:szCs w:val="18"/>
+        </w:rPr>
+        <w:t xml:space="preserve"> Gateway VLAN 160 - Servers</w:t>
+      </w:r>
+    </w:p>
+    <w:p>
+      <w:pPr>
+        <w:pStyle w:val="Ttulo2"/>
+        <w:rPr>
+          <w:b w:val="0"/>
+          <w:bCs w:val="0"/>
+          <w:color w:val="000000" w:themeColor="text1"/>
+          <w:sz w:val="18"/>
+          <w:szCs w:val="18"/>
+        </w:rPr>
+      </w:pPr>
+      <w:r>
+        <w:rPr>
+          <w:b w:val="0"/>
+          <w:bCs w:val="0"/>
+          <w:color w:val="000000" w:themeColor="text1"/>
+          <w:sz w:val="18"/>
+          <w:szCs w:val="18"/>
+        </w:rPr>
+        <w:t xml:space="preserve"> </w:t>
+      </w:r>
+      <w:proofErr w:type="spellStart"/>
+      <w:r>
+        <w:rPr>
+          <w:b w:val="0"/>
+          <w:bCs w:val="0"/>
+          <w:color w:val="000000" w:themeColor="text1"/>
+          <w:sz w:val="18"/>
+          <w:szCs w:val="18"/>
+        </w:rPr>
+        <w:t>encapsulation</w:t>
+      </w:r>
+      <w:proofErr w:type="spellEnd"/>
+      <w:r>
+        <w:rPr>
+          <w:b w:val="0"/>
+          <w:bCs w:val="0"/>
+          <w:color w:val="000000" w:themeColor="text1"/>
+          <w:sz w:val="18"/>
+          <w:szCs w:val="18"/>
+        </w:rPr>
+        <w:t xml:space="preserve"> dot1Q 160</w:t>
+      </w:r>
+    </w:p>
+    <w:p>
+      <w:pPr>
+        <w:pStyle w:val="Ttulo2"/>
+        <w:rPr>
+          <w:b w:val="0"/>
+          <w:bCs w:val="0"/>
+          <w:color w:val="000000" w:themeColor="text1"/>
+          <w:sz w:val="18"/>
+          <w:szCs w:val="18"/>
+        </w:rPr>
+      </w:pPr>
+      <w:r>
+        <w:rPr>
+          <w:b w:val="0"/>
+          <w:bCs w:val="0"/>
+          <w:color w:val="000000" w:themeColor="text1"/>
+          <w:sz w:val="18"/>
+          <w:szCs w:val="18"/>
+        </w:rPr>
+        <w:t xml:space="preserve"> </w:t>
+      </w:r>
+      <w:proofErr w:type="spellStart"/>
+      <w:r>
+        <w:rPr>
+          <w:b w:val="0"/>
+          <w:bCs w:val="0"/>
+          <w:color w:val="000000" w:themeColor="text1"/>
+          <w:sz w:val="18"/>
+          <w:szCs w:val="18"/>
+        </w:rPr>
+        <w:t>ip</w:t>
+      </w:r>
+      <w:proofErr w:type="spellEnd"/>
+      <w:r>
+        <w:rPr>
+          <w:b w:val="0"/>
+          <w:bCs w:val="0"/>
+          <w:color w:val="000000" w:themeColor="text1"/>
+          <w:sz w:val="18"/>
+          <w:szCs w:val="18"/>
+        </w:rPr>
+        <w:t xml:space="preserve"> </w:t>
+      </w:r>
+      <w:proofErr w:type="spellStart"/>
+      <w:r>
+        <w:rPr>
+          <w:b w:val="0"/>
+          <w:bCs w:val="0"/>
+          <w:color w:val="000000" w:themeColor="text1"/>
+          <w:sz w:val="18"/>
+          <w:szCs w:val="18"/>
+        </w:rPr>
+        <w:t>address</w:t>
+      </w:r>
+      <w:proofErr w:type="spellEnd"/>
+      <w:r>
+        <w:rPr>
+          <w:b w:val="0"/>
+          <w:bCs w:val="0"/>
+          <w:color w:val="000000" w:themeColor="text1"/>
+          <w:sz w:val="18"/>
+          <w:szCs w:val="18"/>
+        </w:rPr>
+        <w:t xml:space="preserve"> 10.99.9.129 255.255.255.224</w:t>
+      </w:r>
+    </w:p>
+    <w:p>
+      <w:pPr>
+        <w:pStyle w:val="Ttulo2"/>
+        <w:rPr>
+          <w:color w:val="215E99" w:themeColor="text2" w:themeTint="BF"/>
+        </w:rPr>
+      </w:pPr>
+      <w:r>
+        <w:rPr>
+          <w:color w:val="215E99" w:themeColor="text2" w:themeTint="BF"/>
+        </w:rPr>
+        <w:t>Configuração do Router CVL (Covilhã)</w:t>
+      </w:r>
+    </w:p>
+    <w:p>
+      <w:pPr>
+        <w:pStyle w:val="Ttulo2"/>
+        <w:jc w:val="both"/>
+        <w:rPr>
+          <w:b w:val="0"/>
+          <w:bCs w:val="0"/>
+          <w:color w:val="000000" w:themeColor="text1"/>
+          <w:sz w:val="22"/>
+          <w:szCs w:val="22"/>
+        </w:rPr>
+      </w:pPr>
+      <w:r>
+        <w:rPr>
+          <w:b w:val="0"/>
+          <w:bCs w:val="0"/>
+          <w:color w:val="000000" w:themeColor="text1"/>
+          <w:sz w:val="22"/>
+          <w:szCs w:val="22"/>
+        </w:rPr>
+        <w:t>O router da Covilhã gere os segmentos de rede locais e a ligação ao ISP MEO</w:t>
+      </w:r>
+    </w:p>
+    <w:p>
+      <w:pPr>
+        <w:pStyle w:val="Ttulo2"/>
+        <w:jc w:val="both"/>
+        <w:rPr>
+          <w:b w:val="0"/>
+          <w:bCs w:val="0"/>
+          <w:color w:val="000000" w:themeColor="text1"/>
+          <w:sz w:val="22"/>
+          <w:szCs w:val="22"/>
+        </w:rPr>
+      </w:pPr>
+      <w:r>
+        <w:rPr>
+          <w:b w:val="0"/>
+          <w:bCs w:val="0"/>
+          <w:color w:val="000000" w:themeColor="text1"/>
+          <w:sz w:val="22"/>
+          <w:szCs w:val="22"/>
+        </w:rPr>
+        <w:t>Interface WAN (Ligação ao ISP):</w:t>
+      </w:r>
+    </w:p>
+    <w:p>
+      <w:pPr>
+        <w:pStyle w:val="Ttulo2"/>
+        <w:rPr>
+          <w:color w:val="000000" w:themeColor="text1"/>
+          <w:sz w:val="22"/>
+          <w:szCs w:val="22"/>
+        </w:rPr>
+      </w:pPr>
+    </w:p>
+    <w:p>
+      <w:pPr>
+        <w:pStyle w:val="Ttulo2"/>
+        <w:rPr>
+          <w:b w:val="0"/>
+          <w:bCs w:val="0"/>
+          <w:i/>
+          <w:iCs/>
+          <w:color w:val="000000" w:themeColor="text1"/>
+          <w:sz w:val="18"/>
+          <w:szCs w:val="18"/>
+        </w:rPr>
+      </w:pPr>
+      <w:r>
+        <w:rPr>
+          <w:b w:val="0"/>
+          <w:bCs w:val="0"/>
+          <w:i/>
+          <w:iCs/>
+          <w:color w:val="000000" w:themeColor="text1"/>
+          <w:sz w:val="18"/>
+          <w:szCs w:val="18"/>
+        </w:rPr>
+        <w:t>interface Serial 0/3/0</w:t>
+      </w:r>
+    </w:p>
+    <w:p>
+      <w:pPr>
+        <w:pStyle w:val="Ttulo2"/>
+        <w:rPr>
+          <w:b w:val="0"/>
+          <w:bCs w:val="0"/>
+          <w:i/>
+          <w:iCs/>
+          <w:color w:val="000000" w:themeColor="text1"/>
+          <w:sz w:val="18"/>
+          <w:szCs w:val="18"/>
+        </w:rPr>
+      </w:pPr>
+      <w:r>
+        <w:rPr>
+          <w:b w:val="0"/>
+          <w:bCs w:val="0"/>
+          <w:i/>
+          <w:iCs/>
+          <w:color w:val="000000" w:themeColor="text1"/>
+          <w:sz w:val="18"/>
+          <w:szCs w:val="18"/>
+        </w:rPr>
+        <w:t xml:space="preserve"> </w:t>
+      </w:r>
+      <w:proofErr w:type="spellStart"/>
+      <w:r>
+        <w:rPr>
+          <w:b w:val="0"/>
+          <w:bCs w:val="0"/>
+          <w:i/>
+          <w:iCs/>
+          <w:color w:val="000000" w:themeColor="text1"/>
+          <w:sz w:val="18"/>
+          <w:szCs w:val="18"/>
+        </w:rPr>
+        <w:t>description</w:t>
+      </w:r>
+      <w:proofErr w:type="spellEnd"/>
+      <w:r>
+        <w:rPr>
+          <w:b w:val="0"/>
+          <w:bCs w:val="0"/>
+          <w:i/>
+          <w:iCs/>
+          <w:color w:val="000000" w:themeColor="text1"/>
+          <w:sz w:val="18"/>
+          <w:szCs w:val="18"/>
+        </w:rPr>
+        <w:t xml:space="preserve"> </w:t>
+      </w:r>
+      <w:proofErr w:type="spellStart"/>
+      <w:r>
+        <w:rPr>
+          <w:b w:val="0"/>
+          <w:bCs w:val="0"/>
+          <w:i/>
+          <w:iCs/>
+          <w:color w:val="000000" w:themeColor="text1"/>
+          <w:sz w:val="18"/>
+          <w:szCs w:val="18"/>
+        </w:rPr>
+        <w:t>Ligacao</w:t>
+      </w:r>
+      <w:proofErr w:type="spellEnd"/>
+      <w:r>
+        <w:rPr>
+          <w:b w:val="0"/>
+          <w:bCs w:val="0"/>
+          <w:i/>
+          <w:iCs/>
+          <w:color w:val="000000" w:themeColor="text1"/>
+          <w:sz w:val="18"/>
+          <w:szCs w:val="18"/>
+        </w:rPr>
+        <w:t xml:space="preserve"> ao ISP MEO</w:t>
+      </w:r>
+    </w:p>
+    <w:p>
+      <w:pPr>
+        <w:pStyle w:val="Ttulo2"/>
+        <w:rPr>
+          <w:b w:val="0"/>
+          <w:bCs w:val="0"/>
+          <w:i/>
+          <w:iCs/>
+          <w:color w:val="000000" w:themeColor="text1"/>
+          <w:sz w:val="18"/>
+          <w:szCs w:val="18"/>
+        </w:rPr>
+      </w:pPr>
+      <w:r>
+        <w:rPr>
+          <w:b w:val="0"/>
+          <w:bCs w:val="0"/>
+          <w:i/>
+          <w:iCs/>
+          <w:color w:val="000000" w:themeColor="text1"/>
+          <w:sz w:val="18"/>
+          <w:szCs w:val="18"/>
+        </w:rPr>
+        <w:t xml:space="preserve"> </w:t>
+      </w:r>
+      <w:proofErr w:type="spellStart"/>
+      <w:r>
+        <w:rPr>
+          <w:b w:val="0"/>
+          <w:bCs w:val="0"/>
+          <w:i/>
+          <w:iCs/>
+          <w:color w:val="000000" w:themeColor="text1"/>
+          <w:sz w:val="18"/>
+          <w:szCs w:val="18"/>
+        </w:rPr>
+        <w:t>ip</w:t>
+      </w:r>
+      <w:proofErr w:type="spellEnd"/>
+      <w:r>
+        <w:rPr>
+          <w:b w:val="0"/>
+          <w:bCs w:val="0"/>
+          <w:i/>
+          <w:iCs/>
+          <w:color w:val="000000" w:themeColor="text1"/>
+          <w:sz w:val="18"/>
+          <w:szCs w:val="18"/>
+        </w:rPr>
+        <w:t xml:space="preserve"> </w:t>
+      </w:r>
+      <w:proofErr w:type="spellStart"/>
+      <w:r>
+        <w:rPr>
+          <w:b w:val="0"/>
+          <w:bCs w:val="0"/>
+          <w:i/>
+          <w:iCs/>
+          <w:color w:val="000000" w:themeColor="text1"/>
+          <w:sz w:val="18"/>
+          <w:szCs w:val="18"/>
+        </w:rPr>
+        <w:t>address</w:t>
+      </w:r>
+      <w:proofErr w:type="spellEnd"/>
+      <w:r>
+        <w:rPr>
+          <w:b w:val="0"/>
+          <w:bCs w:val="0"/>
+          <w:i/>
+          <w:iCs/>
+          <w:color w:val="000000" w:themeColor="text1"/>
+          <w:sz w:val="18"/>
+          <w:szCs w:val="18"/>
+        </w:rPr>
+        <w:t xml:space="preserve"> 91.209.231.141 255.255.255.252</w:t>
+      </w:r>
+    </w:p>
+    <w:p>
+      <w:pPr>
+        <w:pStyle w:val="Ttulo2"/>
+        <w:rPr>
+          <w:b w:val="0"/>
+          <w:bCs w:val="0"/>
+          <w:i/>
+          <w:iCs/>
+          <w:color w:val="000000" w:themeColor="text1"/>
+          <w:sz w:val="18"/>
+          <w:szCs w:val="18"/>
+        </w:rPr>
+      </w:pPr>
+      <w:r>
+        <w:rPr>
+          <w:b w:val="0"/>
+          <w:bCs w:val="0"/>
+          <w:i/>
+          <w:iCs/>
+          <w:color w:val="000000" w:themeColor="text1"/>
+          <w:sz w:val="18"/>
+          <w:szCs w:val="18"/>
+        </w:rPr>
+        <w:t xml:space="preserve"> no </w:t>
+      </w:r>
+      <w:proofErr w:type="spellStart"/>
+      <w:r>
+        <w:rPr>
+          <w:b w:val="0"/>
+          <w:bCs w:val="0"/>
+          <w:i/>
+          <w:iCs/>
+          <w:color w:val="000000" w:themeColor="text1"/>
+          <w:sz w:val="18"/>
+          <w:szCs w:val="18"/>
+        </w:rPr>
+        <w:t>shutdown</w:t>
+      </w:r>
+      <w:proofErr w:type="spellEnd"/>
+    </w:p>
+    <w:p>
+      <w:pPr>
+        <w:pStyle w:val="Ttulo2"/>
+      </w:pPr>
+      <w:r>
+        <w:t xml:space="preserve">Interfaces LAN (Exemplo para VLAN 30 - </w:t>
+      </w:r>
+      <w:proofErr w:type="spellStart"/>
+      <w:r>
+        <w:t>Guest</w:t>
+      </w:r>
+      <w:proofErr w:type="spellEnd"/>
+      <w:r>
+        <w:t xml:space="preserve"> e VLAN 500 - Management):</w:t>
+      </w:r>
+    </w:p>
+    <w:p>
+      <w:pPr>
+        <w:pStyle w:val="Ttulo2"/>
+        <w:rPr>
+          <w:b w:val="0"/>
+          <w:bCs w:val="0"/>
+          <w:i/>
+          <w:iCs/>
+          <w:color w:val="000000" w:themeColor="text1"/>
+          <w:sz w:val="18"/>
+          <w:szCs w:val="18"/>
+        </w:rPr>
+      </w:pPr>
+      <w:r>
+        <w:rPr>
+          <w:b w:val="0"/>
+          <w:bCs w:val="0"/>
+          <w:i/>
+          <w:iCs/>
+          <w:color w:val="000000" w:themeColor="text1"/>
+          <w:sz w:val="18"/>
+          <w:szCs w:val="18"/>
+        </w:rPr>
+        <w:t xml:space="preserve">interface </w:t>
+      </w:r>
+      <w:proofErr w:type="spellStart"/>
+      <w:r>
+        <w:rPr>
+          <w:b w:val="0"/>
+          <w:bCs w:val="0"/>
+          <w:i/>
+          <w:iCs/>
+          <w:color w:val="000000" w:themeColor="text1"/>
+          <w:sz w:val="18"/>
+          <w:szCs w:val="18"/>
+        </w:rPr>
+        <w:t>GigabitEthernet</w:t>
+      </w:r>
+      <w:proofErr w:type="spellEnd"/>
+      <w:r>
+        <w:rPr>
+          <w:b w:val="0"/>
+          <w:bCs w:val="0"/>
+          <w:i/>
+          <w:iCs/>
+          <w:color w:val="000000" w:themeColor="text1"/>
+          <w:sz w:val="18"/>
+          <w:szCs w:val="18"/>
+        </w:rPr>
+        <w:t xml:space="preserve"> 0/0</w:t>
+      </w:r>
+    </w:p>
+    <w:p>
+      <w:pPr>
+        <w:pStyle w:val="Ttulo2"/>
+        <w:rPr>
+          <w:b w:val="0"/>
+          <w:bCs w:val="0"/>
+          <w:i/>
+          <w:iCs/>
+          <w:color w:val="000000" w:themeColor="text1"/>
+          <w:sz w:val="18"/>
+          <w:szCs w:val="18"/>
+        </w:rPr>
+      </w:pPr>
+      <w:r>
+        <w:rPr>
+          <w:b w:val="0"/>
+          <w:bCs w:val="0"/>
+          <w:i/>
+          <w:iCs/>
+          <w:color w:val="000000" w:themeColor="text1"/>
+          <w:sz w:val="18"/>
+          <w:szCs w:val="18"/>
+        </w:rPr>
+        <w:t xml:space="preserve"> no </w:t>
+      </w:r>
+      <w:proofErr w:type="spellStart"/>
+      <w:r>
+        <w:rPr>
+          <w:b w:val="0"/>
+          <w:bCs w:val="0"/>
+          <w:i/>
+          <w:iCs/>
+          <w:color w:val="000000" w:themeColor="text1"/>
+          <w:sz w:val="18"/>
+          <w:szCs w:val="18"/>
+        </w:rPr>
+        <w:t>shutdown</w:t>
+      </w:r>
+      <w:proofErr w:type="spellEnd"/>
+    </w:p>
+    <w:p>
+      <w:pPr>
+        <w:pStyle w:val="Ttulo2"/>
+        <w:rPr>
+          <w:b w:val="0"/>
+          <w:bCs w:val="0"/>
+          <w:i/>
+          <w:iCs/>
+          <w:color w:val="000000" w:themeColor="text1"/>
+          <w:sz w:val="18"/>
+          <w:szCs w:val="18"/>
+        </w:rPr>
+      </w:pPr>
+    </w:p>
+    <w:p>
+      <w:pPr>
+        <w:pStyle w:val="Ttulo2"/>
+        <w:rPr>
+          <w:b w:val="0"/>
+          <w:bCs w:val="0"/>
+          <w:i/>
+          <w:iCs/>
+          <w:color w:val="000000" w:themeColor="text1"/>
+          <w:sz w:val="18"/>
+          <w:szCs w:val="18"/>
+        </w:rPr>
+      </w:pPr>
+      <w:r>
+        <w:rPr>
+          <w:b w:val="0"/>
+          <w:bCs w:val="0"/>
+          <w:i/>
+          <w:iCs/>
+          <w:color w:val="000000" w:themeColor="text1"/>
+          <w:sz w:val="18"/>
+          <w:szCs w:val="18"/>
+        </w:rPr>
+        <w:t xml:space="preserve">interface </w:t>
+      </w:r>
+      <w:proofErr w:type="spellStart"/>
+      <w:r>
+        <w:rPr>
+          <w:b w:val="0"/>
+          <w:bCs w:val="0"/>
+          <w:i/>
+          <w:iCs/>
+          <w:color w:val="000000" w:themeColor="text1"/>
+          <w:sz w:val="18"/>
+          <w:szCs w:val="18"/>
+        </w:rPr>
+        <w:t>GigabitEthernet</w:t>
+      </w:r>
+      <w:proofErr w:type="spellEnd"/>
+      <w:r>
+        <w:rPr>
+          <w:b w:val="0"/>
+          <w:bCs w:val="0"/>
+          <w:i/>
+          <w:iCs/>
+          <w:color w:val="000000" w:themeColor="text1"/>
+          <w:sz w:val="18"/>
+          <w:szCs w:val="18"/>
+        </w:rPr>
+        <w:t xml:space="preserve"> 0/0.30</w:t>
+      </w:r>
+    </w:p>
+    <w:p>
+      <w:pPr>
+        <w:pStyle w:val="Ttulo2"/>
+        <w:rPr>
+          <w:b w:val="0"/>
+          <w:bCs w:val="0"/>
+          <w:i/>
+          <w:iCs/>
+          <w:color w:val="000000" w:themeColor="text1"/>
+          <w:sz w:val="18"/>
+          <w:szCs w:val="18"/>
+        </w:rPr>
+      </w:pPr>
+      <w:r>
+        <w:rPr>
+          <w:b w:val="0"/>
+          <w:bCs w:val="0"/>
+          <w:i/>
+          <w:iCs/>
+          <w:color w:val="000000" w:themeColor="text1"/>
+          <w:sz w:val="18"/>
+          <w:szCs w:val="18"/>
+        </w:rPr>
+        <w:t xml:space="preserve"> </w:t>
+      </w:r>
+      <w:proofErr w:type="spellStart"/>
+      <w:r>
+        <w:rPr>
+          <w:b w:val="0"/>
+          <w:bCs w:val="0"/>
+          <w:i/>
+          <w:iCs/>
+          <w:color w:val="000000" w:themeColor="text1"/>
+          <w:sz w:val="18"/>
+          <w:szCs w:val="18"/>
+        </w:rPr>
+        <w:t>description</w:t>
+      </w:r>
+      <w:proofErr w:type="spellEnd"/>
+      <w:r>
+        <w:rPr>
+          <w:b w:val="0"/>
+          <w:bCs w:val="0"/>
+          <w:i/>
+          <w:iCs/>
+          <w:color w:val="000000" w:themeColor="text1"/>
+          <w:sz w:val="18"/>
+          <w:szCs w:val="18"/>
+        </w:rPr>
+        <w:t xml:space="preserve"> Gateway VLAN 30 - </w:t>
+      </w:r>
+      <w:proofErr w:type="spellStart"/>
+      <w:r>
+        <w:rPr>
+          <w:b w:val="0"/>
+          <w:bCs w:val="0"/>
+          <w:i/>
+          <w:iCs/>
+          <w:color w:val="000000" w:themeColor="text1"/>
+          <w:sz w:val="18"/>
+          <w:szCs w:val="18"/>
+        </w:rPr>
+        <w:t>Guest</w:t>
+      </w:r>
+      <w:proofErr w:type="spellEnd"/>
+    </w:p>
+    <w:p>
+      <w:pPr>
+        <w:pStyle w:val="Ttulo2"/>
+        <w:rPr>
+          <w:b w:val="0"/>
+          <w:bCs w:val="0"/>
+          <w:i/>
+          <w:iCs/>
+          <w:color w:val="000000" w:themeColor="text1"/>
+          <w:sz w:val="18"/>
+          <w:szCs w:val="18"/>
+        </w:rPr>
+      </w:pPr>
+      <w:r>
+        <w:rPr>
+          <w:b w:val="0"/>
+          <w:bCs w:val="0"/>
+          <w:i/>
+          <w:iCs/>
+          <w:color w:val="000000" w:themeColor="text1"/>
+          <w:sz w:val="18"/>
+          <w:szCs w:val="18"/>
+        </w:rPr>
+        <w:t xml:space="preserve"> </w:t>
+      </w:r>
+      <w:proofErr w:type="spellStart"/>
+      <w:r>
+        <w:rPr>
+          <w:b w:val="0"/>
+          <w:bCs w:val="0"/>
+          <w:i/>
+          <w:iCs/>
+          <w:color w:val="000000" w:themeColor="text1"/>
+          <w:sz w:val="18"/>
+          <w:szCs w:val="18"/>
+        </w:rPr>
+        <w:t>encapsulation</w:t>
+      </w:r>
+      <w:proofErr w:type="spellEnd"/>
+      <w:r>
+        <w:rPr>
+          <w:b w:val="0"/>
+          <w:bCs w:val="0"/>
+          <w:i/>
+          <w:iCs/>
+          <w:color w:val="000000" w:themeColor="text1"/>
+          <w:sz w:val="18"/>
+          <w:szCs w:val="18"/>
+        </w:rPr>
+        <w:t xml:space="preserve"> dot1Q 30</w:t>
+      </w:r>
+    </w:p>
+    <w:p>
+      <w:pPr>
+        <w:pStyle w:val="Ttulo2"/>
+        <w:rPr>
+          <w:b w:val="0"/>
+          <w:bCs w:val="0"/>
+          <w:i/>
+          <w:iCs/>
+          <w:color w:val="000000" w:themeColor="text1"/>
+          <w:sz w:val="18"/>
+          <w:szCs w:val="18"/>
+        </w:rPr>
+      </w:pPr>
+      <w:r>
+        <w:rPr>
+          <w:b w:val="0"/>
+          <w:bCs w:val="0"/>
+          <w:i/>
+          <w:iCs/>
+          <w:color w:val="000000" w:themeColor="text1"/>
+          <w:sz w:val="18"/>
+          <w:szCs w:val="18"/>
+        </w:rPr>
+        <w:t xml:space="preserve"> </w:t>
+      </w:r>
+      <w:proofErr w:type="spellStart"/>
+      <w:r>
+        <w:rPr>
+          <w:b w:val="0"/>
+          <w:bCs w:val="0"/>
+          <w:i/>
+          <w:iCs/>
+          <w:color w:val="000000" w:themeColor="text1"/>
+          <w:sz w:val="18"/>
+          <w:szCs w:val="18"/>
+        </w:rPr>
+        <w:t>ip</w:t>
+      </w:r>
+      <w:proofErr w:type="spellEnd"/>
+      <w:r>
+        <w:rPr>
+          <w:b w:val="0"/>
+          <w:bCs w:val="0"/>
+          <w:i/>
+          <w:iCs/>
+          <w:color w:val="000000" w:themeColor="text1"/>
+          <w:sz w:val="18"/>
+          <w:szCs w:val="18"/>
+        </w:rPr>
+        <w:t xml:space="preserve"> </w:t>
+      </w:r>
+      <w:proofErr w:type="spellStart"/>
+      <w:r>
+        <w:rPr>
+          <w:b w:val="0"/>
+          <w:bCs w:val="0"/>
+          <w:i/>
+          <w:iCs/>
+          <w:color w:val="000000" w:themeColor="text1"/>
+          <w:sz w:val="18"/>
+          <w:szCs w:val="18"/>
+        </w:rPr>
+        <w:t>address</w:t>
+      </w:r>
+      <w:proofErr w:type="spellEnd"/>
+      <w:r>
+        <w:rPr>
+          <w:b w:val="0"/>
+          <w:bCs w:val="0"/>
+          <w:i/>
+          <w:iCs/>
+          <w:color w:val="000000" w:themeColor="text1"/>
+          <w:sz w:val="18"/>
+          <w:szCs w:val="18"/>
+        </w:rPr>
+        <w:t xml:space="preserve"> 10.30.9.1 255.255.255.192</w:t>
+      </w:r>
+    </w:p>
+    <w:p>
+      <w:pPr>
+        <w:pStyle w:val="Ttulo2"/>
+        <w:rPr>
+          <w:b w:val="0"/>
+          <w:bCs w:val="0"/>
+          <w:i/>
+          <w:iCs/>
+          <w:color w:val="000000" w:themeColor="text1"/>
+          <w:sz w:val="18"/>
+          <w:szCs w:val="18"/>
+        </w:rPr>
+      </w:pPr>
+    </w:p>
+    <w:p>
+      <w:pPr>
+        <w:pStyle w:val="Ttulo2"/>
+        <w:rPr>
+          <w:b w:val="0"/>
+          <w:bCs w:val="0"/>
+          <w:i/>
+          <w:iCs/>
+          <w:color w:val="000000" w:themeColor="text1"/>
+          <w:sz w:val="18"/>
+          <w:szCs w:val="18"/>
+        </w:rPr>
+      </w:pPr>
+      <w:r>
+        <w:rPr>
+          <w:b w:val="0"/>
+          <w:bCs w:val="0"/>
+          <w:i/>
+          <w:iCs/>
+          <w:color w:val="000000" w:themeColor="text1"/>
+          <w:sz w:val="18"/>
+          <w:szCs w:val="18"/>
+        </w:rPr>
+        <w:t xml:space="preserve">interface </w:t>
+      </w:r>
+      <w:proofErr w:type="spellStart"/>
+      <w:r>
+        <w:rPr>
+          <w:b w:val="0"/>
+          <w:bCs w:val="0"/>
+          <w:i/>
+          <w:iCs/>
+          <w:color w:val="000000" w:themeColor="text1"/>
+          <w:sz w:val="18"/>
+          <w:szCs w:val="18"/>
+        </w:rPr>
+        <w:t>GigabitEthernet</w:t>
+      </w:r>
+      <w:proofErr w:type="spellEnd"/>
+      <w:r>
+        <w:rPr>
+          <w:b w:val="0"/>
+          <w:bCs w:val="0"/>
+          <w:i/>
+          <w:iCs/>
+          <w:color w:val="000000" w:themeColor="text1"/>
+          <w:sz w:val="18"/>
+          <w:szCs w:val="18"/>
+        </w:rPr>
+        <w:t xml:space="preserve"> 0/0.500</w:t>
+      </w:r>
+    </w:p>
+    <w:p>
+      <w:pPr>
+        <w:pStyle w:val="Ttulo2"/>
+        <w:rPr>
+          <w:b w:val="0"/>
+          <w:bCs w:val="0"/>
+          <w:i/>
+          <w:iCs/>
+          <w:color w:val="000000" w:themeColor="text1"/>
+          <w:sz w:val="18"/>
+          <w:szCs w:val="18"/>
+        </w:rPr>
+      </w:pPr>
+      <w:r>
+        <w:rPr>
+          <w:b w:val="0"/>
+          <w:bCs w:val="0"/>
+          <w:i/>
+          <w:iCs/>
+          <w:color w:val="000000" w:themeColor="text1"/>
+          <w:sz w:val="18"/>
+          <w:szCs w:val="18"/>
+        </w:rPr>
+        <w:t xml:space="preserve"> </w:t>
+      </w:r>
+      <w:proofErr w:type="spellStart"/>
+      <w:r>
+        <w:rPr>
+          <w:b w:val="0"/>
+          <w:bCs w:val="0"/>
+          <w:i/>
+          <w:iCs/>
+          <w:color w:val="000000" w:themeColor="text1"/>
+          <w:sz w:val="18"/>
+          <w:szCs w:val="18"/>
+        </w:rPr>
+        <w:t>description</w:t>
+      </w:r>
+      <w:proofErr w:type="spellEnd"/>
+      <w:r>
+        <w:rPr>
+          <w:b w:val="0"/>
+          <w:bCs w:val="0"/>
+          <w:i/>
+          <w:iCs/>
+          <w:color w:val="000000" w:themeColor="text1"/>
+          <w:sz w:val="18"/>
+          <w:szCs w:val="18"/>
+        </w:rPr>
+        <w:t xml:space="preserve"> Gateway VLAN 500 - Management</w:t>
+      </w:r>
+    </w:p>
+    <w:p>
+      <w:pPr>
+        <w:pStyle w:val="Ttulo2"/>
+        <w:rPr>
+          <w:b w:val="0"/>
+          <w:bCs w:val="0"/>
+          <w:i/>
+          <w:iCs/>
+          <w:color w:val="000000" w:themeColor="text1"/>
+          <w:sz w:val="18"/>
+          <w:szCs w:val="18"/>
+        </w:rPr>
+      </w:pPr>
+      <w:r>
+        <w:rPr>
+          <w:b w:val="0"/>
+          <w:bCs w:val="0"/>
+          <w:i/>
+          <w:iCs/>
+          <w:color w:val="000000" w:themeColor="text1"/>
+          <w:sz w:val="18"/>
+          <w:szCs w:val="18"/>
+        </w:rPr>
+        <w:lastRenderedPageBreak/>
+        <w:t xml:space="preserve"> </w:t>
+      </w:r>
+      <w:proofErr w:type="spellStart"/>
+      <w:r>
+        <w:rPr>
+          <w:b w:val="0"/>
+          <w:bCs w:val="0"/>
+          <w:i/>
+          <w:iCs/>
+          <w:color w:val="000000" w:themeColor="text1"/>
+          <w:sz w:val="18"/>
+          <w:szCs w:val="18"/>
+        </w:rPr>
+        <w:t>encapsulation</w:t>
+      </w:r>
+      <w:proofErr w:type="spellEnd"/>
+      <w:r>
+        <w:rPr>
+          <w:b w:val="0"/>
+          <w:bCs w:val="0"/>
+          <w:i/>
+          <w:iCs/>
+          <w:color w:val="000000" w:themeColor="text1"/>
+          <w:sz w:val="18"/>
+          <w:szCs w:val="18"/>
+        </w:rPr>
+        <w:t xml:space="preserve"> dot1Q 500</w:t>
+      </w:r>
+    </w:p>
+    <w:p>
+      <w:pPr>
+        <w:pStyle w:val="Ttulo2"/>
+        <w:rPr>
+          <w:b w:val="0"/>
+          <w:bCs w:val="0"/>
+          <w:i/>
+          <w:iCs/>
+          <w:color w:val="000000" w:themeColor="text1"/>
+          <w:sz w:val="18"/>
+          <w:szCs w:val="18"/>
+        </w:rPr>
+      </w:pPr>
+      <w:r>
+        <w:rPr>
+          <w:b w:val="0"/>
+          <w:bCs w:val="0"/>
+          <w:i/>
+          <w:iCs/>
+          <w:color w:val="000000" w:themeColor="text1"/>
+          <w:sz w:val="18"/>
+          <w:szCs w:val="18"/>
+        </w:rPr>
+        <w:t xml:space="preserve"> </w:t>
+      </w:r>
+      <w:proofErr w:type="spellStart"/>
+      <w:r>
+        <w:rPr>
+          <w:b w:val="0"/>
+          <w:bCs w:val="0"/>
+          <w:i/>
+          <w:iCs/>
+          <w:color w:val="000000" w:themeColor="text1"/>
+          <w:sz w:val="18"/>
+          <w:szCs w:val="18"/>
+        </w:rPr>
+        <w:t>ip</w:t>
+      </w:r>
+      <w:proofErr w:type="spellEnd"/>
+      <w:r>
+        <w:rPr>
+          <w:b w:val="0"/>
+          <w:bCs w:val="0"/>
+          <w:i/>
+          <w:iCs/>
+          <w:color w:val="000000" w:themeColor="text1"/>
+          <w:sz w:val="18"/>
+          <w:szCs w:val="18"/>
+        </w:rPr>
+        <w:t xml:space="preserve"> </w:t>
+      </w:r>
+      <w:proofErr w:type="spellStart"/>
+      <w:r>
+        <w:rPr>
+          <w:b w:val="0"/>
+          <w:bCs w:val="0"/>
+          <w:i/>
+          <w:iCs/>
+          <w:color w:val="000000" w:themeColor="text1"/>
+          <w:sz w:val="18"/>
+          <w:szCs w:val="18"/>
+        </w:rPr>
+        <w:t>address</w:t>
+      </w:r>
+      <w:proofErr w:type="spellEnd"/>
+      <w:r>
+        <w:rPr>
+          <w:b w:val="0"/>
+          <w:bCs w:val="0"/>
+          <w:i/>
+          <w:iCs/>
+          <w:color w:val="000000" w:themeColor="text1"/>
+          <w:sz w:val="18"/>
+          <w:szCs w:val="18"/>
+        </w:rPr>
+        <w:t xml:space="preserve"> 10.30.9.65 255.255.255.192</w:t>
+      </w:r>
+    </w:p>
+    <w:p>
+      <w:pPr>
+        <w:pStyle w:val="Ttulo2"/>
+        <w:rPr>
+          <w:color w:val="000000" w:themeColor="text1"/>
+          <w:sz w:val="18"/>
+          <w:szCs w:val="18"/>
+        </w:rPr>
+      </w:pPr>
+    </w:p>
+    <w:p>
+      <w:pPr>
+        <w:pStyle w:val="Ttulo2"/>
+        <w:jc w:val="both"/>
+        <w:rPr>
+          <w:b w:val="0"/>
+          <w:bCs w:val="0"/>
+          <w:color w:val="000000" w:themeColor="text1"/>
+          <w:sz w:val="22"/>
+          <w:szCs w:val="22"/>
+        </w:rPr>
+      </w:pPr>
+      <w:r>
+        <w:rPr>
+          <w:b w:val="0"/>
+          <w:bCs w:val="0"/>
+          <w:color w:val="000000" w:themeColor="text1"/>
+          <w:sz w:val="22"/>
+          <w:szCs w:val="22"/>
+        </w:rPr>
+        <w:t xml:space="preserve">A utilização de </w:t>
+      </w:r>
+      <w:proofErr w:type="spellStart"/>
+      <w:proofErr w:type="gramStart"/>
+      <w:r>
+        <w:rPr>
+          <w:b w:val="0"/>
+          <w:bCs w:val="0"/>
+          <w:color w:val="000000" w:themeColor="text1"/>
+          <w:sz w:val="22"/>
+          <w:szCs w:val="22"/>
+        </w:rPr>
+        <w:t>sub-interfaces</w:t>
+      </w:r>
+      <w:proofErr w:type="spellEnd"/>
+      <w:proofErr w:type="gramEnd"/>
+      <w:r>
+        <w:rPr>
+          <w:b w:val="0"/>
+          <w:bCs w:val="0"/>
+          <w:color w:val="000000" w:themeColor="text1"/>
+          <w:sz w:val="22"/>
+          <w:szCs w:val="22"/>
+        </w:rPr>
+        <w:t xml:space="preserve"> justifica-se pela otimização de recursos de hardware, permitindo segmentar o tráfego de múltiplas redes virtuais (</w:t>
+      </w:r>
+      <w:proofErr w:type="spellStart"/>
+      <w:r>
+        <w:rPr>
+          <w:b w:val="0"/>
+          <w:bCs w:val="0"/>
+          <w:color w:val="000000" w:themeColor="text1"/>
+          <w:sz w:val="22"/>
+          <w:szCs w:val="22"/>
+        </w:rPr>
+        <w:t>VLANs</w:t>
+      </w:r>
+      <w:proofErr w:type="spellEnd"/>
+      <w:r>
+        <w:rPr>
+          <w:b w:val="0"/>
+          <w:bCs w:val="0"/>
+          <w:color w:val="000000" w:themeColor="text1"/>
+          <w:sz w:val="22"/>
+          <w:szCs w:val="22"/>
+        </w:rPr>
+        <w:t xml:space="preserve">) através de uma única ligação física entre o </w:t>
+      </w:r>
+      <w:proofErr w:type="spellStart"/>
+      <w:r>
+        <w:rPr>
+          <w:b w:val="0"/>
+          <w:bCs w:val="0"/>
+          <w:color w:val="000000" w:themeColor="text1"/>
+          <w:sz w:val="22"/>
+          <w:szCs w:val="22"/>
+        </w:rPr>
+        <w:t>switch</w:t>
+      </w:r>
+      <w:proofErr w:type="spellEnd"/>
+      <w:r>
+        <w:rPr>
+          <w:b w:val="0"/>
+          <w:bCs w:val="0"/>
+          <w:color w:val="000000" w:themeColor="text1"/>
+          <w:sz w:val="22"/>
+          <w:szCs w:val="22"/>
+        </w:rPr>
+        <w:t xml:space="preserve"> de distribuição e o router. A atribuição sistemática do primeiro </w:t>
+      </w:r>
+      <w:proofErr w:type="spellStart"/>
+      <w:r>
+        <w:rPr>
+          <w:b w:val="0"/>
+          <w:bCs w:val="0"/>
+          <w:color w:val="000000" w:themeColor="text1"/>
+          <w:sz w:val="22"/>
+          <w:szCs w:val="22"/>
+        </w:rPr>
+        <w:t>host</w:t>
+      </w:r>
+      <w:proofErr w:type="spellEnd"/>
+      <w:r>
+        <w:rPr>
+          <w:b w:val="0"/>
+          <w:bCs w:val="0"/>
+          <w:color w:val="000000" w:themeColor="text1"/>
+          <w:sz w:val="22"/>
+          <w:szCs w:val="22"/>
+        </w:rPr>
+        <w:t xml:space="preserve"> utilizável como </w:t>
+      </w:r>
+      <w:proofErr w:type="spellStart"/>
+      <w:r>
+        <w:rPr>
+          <w:b w:val="0"/>
+          <w:bCs w:val="0"/>
+          <w:color w:val="000000" w:themeColor="text1"/>
+          <w:sz w:val="22"/>
+          <w:szCs w:val="22"/>
+        </w:rPr>
+        <w:t>gateway</w:t>
+      </w:r>
+      <w:proofErr w:type="spellEnd"/>
+      <w:r>
+        <w:rPr>
+          <w:b w:val="0"/>
+          <w:bCs w:val="0"/>
+          <w:color w:val="000000" w:themeColor="text1"/>
+          <w:sz w:val="22"/>
+          <w:szCs w:val="22"/>
+        </w:rPr>
+        <w:t xml:space="preserve"> garante uma estrutura de rede previsível e facilita futuras tarefas de manutenção e expansão.</w:t>
+      </w:r>
+    </w:p>
+    <w:p>
+      <w:pPr>
+        <w:pStyle w:val="Ttulo2"/>
+      </w:pPr>
+    </w:p>
+    <w:p>
+      <w:pPr>
+        <w:pStyle w:val="Ttulo2"/>
+      </w:pPr>
+      <w:r>
+        <w:t>5.</w:t>
+      </w:r>
+      <w:r>
+        <w:t>3</w:t>
+      </w:r>
+      <w:r>
+        <w:t xml:space="preserve">. </w:t>
+      </w:r>
+      <w:r>
+        <w:t>Configuração do Servidor DHCP</w:t>
+      </w:r>
+    </w:p>
+    <w:p>
+      <w:pPr>
+        <w:pStyle w:val="Ttulo2"/>
+      </w:pPr>
+      <w:r>
+        <w:t>Aveiro (AVR-DHCP)</w:t>
+      </w:r>
+    </w:p>
+    <w:p>
+      <w:pPr>
+        <w:pStyle w:val="Ttulo2"/>
+        <w:jc w:val="both"/>
+        <w:rPr>
+          <w:b w:val="0"/>
+          <w:bCs w:val="0"/>
+          <w:color w:val="000000" w:themeColor="text1"/>
+          <w:sz w:val="22"/>
+          <w:szCs w:val="22"/>
+        </w:rPr>
+      </w:pPr>
+      <w:r>
+        <w:rPr>
+          <w:b w:val="0"/>
+          <w:bCs w:val="0"/>
+          <w:color w:val="000000" w:themeColor="text1"/>
+          <w:sz w:val="22"/>
+          <w:szCs w:val="22"/>
+        </w:rPr>
+        <w:t xml:space="preserve">Justificação do Dimensionamento das Pools DHCP em Aveiro: De acordo com o planeamento IP estabelecido na 1.ª Fase, o bloco base 10.99.9.0/24 foi segmentado via VLSM. Embora o cálculo teórico defina a capacidade total de </w:t>
+      </w:r>
+      <w:proofErr w:type="spellStart"/>
+      <w:r>
+        <w:rPr>
+          <w:b w:val="0"/>
+          <w:bCs w:val="0"/>
+          <w:color w:val="000000" w:themeColor="text1"/>
+          <w:sz w:val="22"/>
+          <w:szCs w:val="22"/>
+        </w:rPr>
+        <w:t>hosts</w:t>
+      </w:r>
+      <w:proofErr w:type="spellEnd"/>
+      <w:r>
+        <w:rPr>
+          <w:b w:val="0"/>
+          <w:bCs w:val="0"/>
+          <w:color w:val="000000" w:themeColor="text1"/>
+          <w:sz w:val="22"/>
+          <w:szCs w:val="22"/>
+        </w:rPr>
+        <w:t xml:space="preserve"> utilizáveis de cada sub-rede (por exemplo, 62 </w:t>
+      </w:r>
+      <w:proofErr w:type="spellStart"/>
+      <w:r>
+        <w:rPr>
+          <w:b w:val="0"/>
+          <w:bCs w:val="0"/>
+          <w:color w:val="000000" w:themeColor="text1"/>
+          <w:sz w:val="22"/>
+          <w:szCs w:val="22"/>
+        </w:rPr>
+        <w:t>hosts</w:t>
+      </w:r>
+      <w:proofErr w:type="spellEnd"/>
+      <w:r>
+        <w:rPr>
+          <w:b w:val="0"/>
+          <w:bCs w:val="0"/>
+          <w:color w:val="000000" w:themeColor="text1"/>
+          <w:sz w:val="22"/>
+          <w:szCs w:val="22"/>
+        </w:rPr>
+        <w:t xml:space="preserve"> para a rede Quiosque num bloco /26 e 30 </w:t>
+      </w:r>
+      <w:proofErr w:type="spellStart"/>
+      <w:r>
+        <w:rPr>
+          <w:b w:val="0"/>
+          <w:bCs w:val="0"/>
+          <w:color w:val="000000" w:themeColor="text1"/>
+          <w:sz w:val="22"/>
+          <w:szCs w:val="22"/>
+        </w:rPr>
+        <w:t>hosts</w:t>
+      </w:r>
+      <w:proofErr w:type="spellEnd"/>
+      <w:r>
+        <w:rPr>
+          <w:b w:val="0"/>
+          <w:bCs w:val="0"/>
+          <w:color w:val="000000" w:themeColor="text1"/>
+          <w:sz w:val="22"/>
+          <w:szCs w:val="22"/>
+        </w:rPr>
+        <w:t xml:space="preserve"> para a rede Servers num bloco /27), a implementação direta do serviço DHCP no Cisco </w:t>
+      </w:r>
+      <w:proofErr w:type="spellStart"/>
+      <w:r>
+        <w:rPr>
+          <w:b w:val="0"/>
+          <w:bCs w:val="0"/>
+          <w:color w:val="000000" w:themeColor="text1"/>
+          <w:sz w:val="22"/>
+          <w:szCs w:val="22"/>
+        </w:rPr>
+        <w:t>Packet</w:t>
+      </w:r>
+      <w:proofErr w:type="spellEnd"/>
+      <w:r>
+        <w:rPr>
+          <w:b w:val="0"/>
+          <w:bCs w:val="0"/>
+          <w:color w:val="000000" w:themeColor="text1"/>
+          <w:sz w:val="22"/>
+          <w:szCs w:val="22"/>
+        </w:rPr>
+        <w:t xml:space="preserve"> </w:t>
+      </w:r>
+      <w:proofErr w:type="spellStart"/>
+      <w:r>
+        <w:rPr>
+          <w:b w:val="0"/>
+          <w:bCs w:val="0"/>
+          <w:color w:val="000000" w:themeColor="text1"/>
+          <w:sz w:val="22"/>
+          <w:szCs w:val="22"/>
+        </w:rPr>
+        <w:t>Tracer</w:t>
+      </w:r>
+      <w:proofErr w:type="spellEnd"/>
+      <w:r>
+        <w:rPr>
+          <w:b w:val="0"/>
+          <w:bCs w:val="0"/>
+          <w:color w:val="000000" w:themeColor="text1"/>
+          <w:sz w:val="22"/>
+          <w:szCs w:val="22"/>
+        </w:rPr>
+        <w:t xml:space="preserve"> exigiu um ajuste fino no parâmetro </w:t>
+      </w:r>
+      <w:proofErr w:type="spellStart"/>
+      <w:r>
+        <w:rPr>
+          <w:b w:val="0"/>
+          <w:bCs w:val="0"/>
+          <w:i/>
+          <w:color w:val="000000" w:themeColor="text1"/>
+          <w:sz w:val="22"/>
+          <w:szCs w:val="22"/>
+        </w:rPr>
+        <w:t>Start</w:t>
+      </w:r>
+      <w:proofErr w:type="spellEnd"/>
+      <w:r>
+        <w:rPr>
+          <w:b w:val="0"/>
+          <w:bCs w:val="0"/>
+          <w:i/>
+          <w:color w:val="000000" w:themeColor="text1"/>
+          <w:sz w:val="22"/>
+          <w:szCs w:val="22"/>
+        </w:rPr>
+        <w:t xml:space="preserve"> IP </w:t>
+      </w:r>
+      <w:proofErr w:type="spellStart"/>
+      <w:r>
+        <w:rPr>
+          <w:b w:val="0"/>
+          <w:bCs w:val="0"/>
+          <w:i/>
+          <w:color w:val="000000" w:themeColor="text1"/>
+          <w:sz w:val="22"/>
+          <w:szCs w:val="22"/>
+        </w:rPr>
+        <w:t>Address</w:t>
+      </w:r>
+      <w:proofErr w:type="spellEnd"/>
+      <w:r>
+        <w:rPr>
+          <w:b w:val="0"/>
+          <w:bCs w:val="0"/>
+          <w:color w:val="000000" w:themeColor="text1"/>
+          <w:sz w:val="22"/>
+          <w:szCs w:val="22"/>
+        </w:rPr>
+        <w:t xml:space="preserve">. Para garantir a integridade da rede e evitar conflitos de atribuição de IP, o endereço de início de cada pool foi configurado para o primeiro endereço IP estritamente livre. Excluiu-se, por omissão, o primeiro </w:t>
+      </w:r>
+      <w:proofErr w:type="spellStart"/>
+      <w:r>
+        <w:rPr>
+          <w:b w:val="0"/>
+          <w:bCs w:val="0"/>
+          <w:color w:val="000000" w:themeColor="text1"/>
+          <w:sz w:val="22"/>
+          <w:szCs w:val="22"/>
+        </w:rPr>
+        <w:t>host</w:t>
+      </w:r>
+      <w:proofErr w:type="spellEnd"/>
+      <w:r>
+        <w:rPr>
+          <w:b w:val="0"/>
+          <w:bCs w:val="0"/>
+          <w:color w:val="000000" w:themeColor="text1"/>
+          <w:sz w:val="22"/>
+          <w:szCs w:val="22"/>
+        </w:rPr>
+        <w:t xml:space="preserve"> de cada bloco, uma vez que este se encontra estaticamente atribuído às </w:t>
+      </w:r>
+      <w:proofErr w:type="spellStart"/>
+      <w:r>
+        <w:rPr>
+          <w:b w:val="0"/>
+          <w:bCs w:val="0"/>
+          <w:color w:val="000000" w:themeColor="text1"/>
+          <w:sz w:val="22"/>
+          <w:szCs w:val="22"/>
+        </w:rPr>
+        <w:t>sub-interfaces</w:t>
+      </w:r>
+      <w:proofErr w:type="spellEnd"/>
+      <w:r>
+        <w:rPr>
+          <w:b w:val="0"/>
+          <w:bCs w:val="0"/>
+          <w:color w:val="000000" w:themeColor="text1"/>
+          <w:sz w:val="22"/>
+          <w:szCs w:val="22"/>
+        </w:rPr>
+        <w:t xml:space="preserve"> de </w:t>
+      </w:r>
+      <w:proofErr w:type="spellStart"/>
+      <w:r>
+        <w:rPr>
+          <w:b w:val="0"/>
+          <w:bCs w:val="0"/>
+          <w:color w:val="000000" w:themeColor="text1"/>
+          <w:sz w:val="22"/>
+          <w:szCs w:val="22"/>
+        </w:rPr>
+        <w:t>gateway</w:t>
+      </w:r>
+      <w:proofErr w:type="spellEnd"/>
+      <w:r>
+        <w:rPr>
+          <w:b w:val="0"/>
+          <w:bCs w:val="0"/>
+          <w:color w:val="000000" w:themeColor="text1"/>
+          <w:sz w:val="22"/>
+          <w:szCs w:val="22"/>
+        </w:rPr>
+        <w:t xml:space="preserve"> no router AVR (em topologia </w:t>
+      </w:r>
+      <w:r>
+        <w:rPr>
+          <w:b w:val="0"/>
+          <w:bCs w:val="0"/>
+          <w:i/>
+          <w:color w:val="000000" w:themeColor="text1"/>
+          <w:sz w:val="22"/>
+          <w:szCs w:val="22"/>
+        </w:rPr>
+        <w:t>router-</w:t>
+      </w:r>
+      <w:proofErr w:type="spellStart"/>
+      <w:r>
+        <w:rPr>
+          <w:b w:val="0"/>
+          <w:bCs w:val="0"/>
+          <w:i/>
+          <w:color w:val="000000" w:themeColor="text1"/>
+          <w:sz w:val="22"/>
+          <w:szCs w:val="22"/>
+        </w:rPr>
+        <w:t>on</w:t>
+      </w:r>
+      <w:proofErr w:type="spellEnd"/>
+      <w:r>
+        <w:rPr>
+          <w:b w:val="0"/>
+          <w:bCs w:val="0"/>
+          <w:i/>
+          <w:color w:val="000000" w:themeColor="text1"/>
+          <w:sz w:val="22"/>
+          <w:szCs w:val="22"/>
+        </w:rPr>
+        <w:t>-a-stick</w:t>
+      </w:r>
+      <w:r>
+        <w:rPr>
+          <w:b w:val="0"/>
+          <w:bCs w:val="0"/>
+          <w:color w:val="000000" w:themeColor="text1"/>
+          <w:sz w:val="22"/>
+          <w:szCs w:val="22"/>
+        </w:rPr>
+        <w:t xml:space="preserve">). Adicionalmente, na </w:t>
+      </w:r>
+      <w:proofErr w:type="spellStart"/>
+      <w:r>
+        <w:rPr>
+          <w:b w:val="0"/>
+          <w:bCs w:val="0"/>
+          <w:color w:val="000000" w:themeColor="text1"/>
+          <w:sz w:val="22"/>
+          <w:szCs w:val="22"/>
+        </w:rPr>
+        <w:t>serverPool</w:t>
+      </w:r>
+      <w:proofErr w:type="spellEnd"/>
+      <w:r>
+        <w:rPr>
+          <w:b w:val="0"/>
+          <w:bCs w:val="0"/>
+          <w:color w:val="000000" w:themeColor="text1"/>
+          <w:sz w:val="22"/>
+          <w:szCs w:val="22"/>
+        </w:rPr>
+        <w:t xml:space="preserve"> (VLAN 160) e na </w:t>
+      </w:r>
+      <w:proofErr w:type="spellStart"/>
+      <w:r>
+        <w:rPr>
+          <w:b w:val="0"/>
+          <w:bCs w:val="0"/>
+          <w:color w:val="000000" w:themeColor="text1"/>
+          <w:sz w:val="22"/>
+          <w:szCs w:val="22"/>
+        </w:rPr>
+        <w:t>PrintersPool</w:t>
+      </w:r>
+      <w:proofErr w:type="spellEnd"/>
+      <w:r>
+        <w:rPr>
+          <w:b w:val="0"/>
+          <w:bCs w:val="0"/>
+          <w:color w:val="000000" w:themeColor="text1"/>
+          <w:sz w:val="22"/>
+          <w:szCs w:val="22"/>
+        </w:rPr>
+        <w:t xml:space="preserve"> (VLAN 16), o </w:t>
+      </w:r>
+      <w:proofErr w:type="spellStart"/>
+      <w:r>
+        <w:rPr>
+          <w:b w:val="0"/>
+          <w:bCs w:val="0"/>
+          <w:i/>
+          <w:color w:val="000000" w:themeColor="text1"/>
+          <w:sz w:val="22"/>
+          <w:szCs w:val="22"/>
+        </w:rPr>
+        <w:t>Start</w:t>
+      </w:r>
+      <w:proofErr w:type="spellEnd"/>
+      <w:r>
+        <w:rPr>
+          <w:b w:val="0"/>
+          <w:bCs w:val="0"/>
+          <w:i/>
+          <w:color w:val="000000" w:themeColor="text1"/>
+          <w:sz w:val="22"/>
+          <w:szCs w:val="22"/>
+        </w:rPr>
+        <w:t xml:space="preserve"> IP</w:t>
+      </w:r>
+      <w:r>
+        <w:rPr>
+          <w:b w:val="0"/>
+          <w:bCs w:val="0"/>
+          <w:color w:val="000000" w:themeColor="text1"/>
+          <w:sz w:val="22"/>
+          <w:szCs w:val="22"/>
+        </w:rPr>
+        <w:t xml:space="preserve"> foi deslocado para 10.99.9.134 e 10.99.9.164, respetivamente. Este avanço contorna os endereços previamente fixados na Tabela de Endereçamento para a infraestrutura local (servidores estáticos NTP, DHCP, DNS, WEB, bem como impressoras e pontos de acesso). O software </w:t>
+      </w:r>
+      <w:proofErr w:type="spellStart"/>
+      <w:r>
+        <w:rPr>
+          <w:b w:val="0"/>
+          <w:bCs w:val="0"/>
+          <w:color w:val="000000" w:themeColor="text1"/>
+          <w:sz w:val="22"/>
+          <w:szCs w:val="22"/>
+        </w:rPr>
+        <w:t>Packet</w:t>
+      </w:r>
+      <w:proofErr w:type="spellEnd"/>
+      <w:r>
+        <w:rPr>
+          <w:b w:val="0"/>
+          <w:bCs w:val="0"/>
+          <w:color w:val="000000" w:themeColor="text1"/>
+          <w:sz w:val="22"/>
+          <w:szCs w:val="22"/>
+        </w:rPr>
+        <w:t xml:space="preserve"> </w:t>
+      </w:r>
+      <w:proofErr w:type="spellStart"/>
+      <w:r>
+        <w:rPr>
+          <w:b w:val="0"/>
+          <w:bCs w:val="0"/>
+          <w:color w:val="000000" w:themeColor="text1"/>
+          <w:sz w:val="22"/>
+          <w:szCs w:val="22"/>
+        </w:rPr>
+        <w:t>Tracer</w:t>
+      </w:r>
+      <w:proofErr w:type="spellEnd"/>
+      <w:r>
+        <w:rPr>
+          <w:b w:val="0"/>
+          <w:bCs w:val="0"/>
+          <w:color w:val="000000" w:themeColor="text1"/>
+          <w:sz w:val="22"/>
+          <w:szCs w:val="22"/>
+        </w:rPr>
+        <w:t xml:space="preserve"> calcula automaticamente o valor de </w:t>
+      </w:r>
+      <w:proofErr w:type="spellStart"/>
+      <w:r>
+        <w:rPr>
+          <w:b w:val="0"/>
+          <w:bCs w:val="0"/>
+          <w:i/>
+          <w:color w:val="000000" w:themeColor="text1"/>
+          <w:sz w:val="22"/>
+          <w:szCs w:val="22"/>
+        </w:rPr>
+        <w:t>Maximum</w:t>
+      </w:r>
+      <w:proofErr w:type="spellEnd"/>
+      <w:r>
+        <w:rPr>
+          <w:b w:val="0"/>
+          <w:bCs w:val="0"/>
+          <w:i/>
+          <w:color w:val="000000" w:themeColor="text1"/>
+          <w:sz w:val="22"/>
+          <w:szCs w:val="22"/>
+        </w:rPr>
+        <w:t xml:space="preserve"> </w:t>
+      </w:r>
+      <w:proofErr w:type="spellStart"/>
+      <w:r>
+        <w:rPr>
+          <w:b w:val="0"/>
+          <w:bCs w:val="0"/>
+          <w:i/>
+          <w:color w:val="000000" w:themeColor="text1"/>
+          <w:sz w:val="22"/>
+          <w:szCs w:val="22"/>
+        </w:rPr>
+        <w:t>Number</w:t>
+      </w:r>
+      <w:proofErr w:type="spellEnd"/>
+      <w:r>
+        <w:rPr>
+          <w:b w:val="0"/>
+          <w:bCs w:val="0"/>
+          <w:i/>
+          <w:color w:val="000000" w:themeColor="text1"/>
+          <w:sz w:val="22"/>
+          <w:szCs w:val="22"/>
+        </w:rPr>
+        <w:t xml:space="preserve"> </w:t>
+      </w:r>
+      <w:proofErr w:type="spellStart"/>
+      <w:r>
+        <w:rPr>
+          <w:b w:val="0"/>
+          <w:bCs w:val="0"/>
+          <w:i/>
+          <w:color w:val="000000" w:themeColor="text1"/>
+          <w:sz w:val="22"/>
+          <w:szCs w:val="22"/>
+        </w:rPr>
+        <w:t>of</w:t>
+      </w:r>
+      <w:proofErr w:type="spellEnd"/>
+      <w:r>
+        <w:rPr>
+          <w:b w:val="0"/>
+          <w:bCs w:val="0"/>
+          <w:i/>
+          <w:color w:val="000000" w:themeColor="text1"/>
+          <w:sz w:val="22"/>
+          <w:szCs w:val="22"/>
+        </w:rPr>
+        <w:t xml:space="preserve"> </w:t>
+      </w:r>
+      <w:proofErr w:type="spellStart"/>
+      <w:r>
+        <w:rPr>
+          <w:b w:val="0"/>
+          <w:bCs w:val="0"/>
+          <w:i/>
+          <w:color w:val="000000" w:themeColor="text1"/>
+          <w:sz w:val="22"/>
+          <w:szCs w:val="22"/>
+        </w:rPr>
+        <w:t>Users</w:t>
+      </w:r>
+      <w:proofErr w:type="spellEnd"/>
+      <w:r>
+        <w:rPr>
+          <w:b w:val="0"/>
+          <w:bCs w:val="0"/>
+          <w:color w:val="000000" w:themeColor="text1"/>
+          <w:sz w:val="22"/>
+          <w:szCs w:val="22"/>
+        </w:rPr>
+        <w:t xml:space="preserve"> (</w:t>
+      </w:r>
+      <w:proofErr w:type="spellStart"/>
+      <w:r>
+        <w:rPr>
+          <w:b w:val="0"/>
+          <w:bCs w:val="0"/>
+          <w:color w:val="000000" w:themeColor="text1"/>
+          <w:sz w:val="22"/>
+          <w:szCs w:val="22"/>
+        </w:rPr>
+        <w:t>ex</w:t>
+      </w:r>
+      <w:proofErr w:type="spellEnd"/>
+      <w:r>
+        <w:rPr>
+          <w:b w:val="0"/>
+          <w:bCs w:val="0"/>
+          <w:color w:val="000000" w:themeColor="text1"/>
+          <w:sz w:val="22"/>
+          <w:szCs w:val="22"/>
+        </w:rPr>
+        <w:t xml:space="preserve">: 26 na </w:t>
+      </w:r>
+      <w:proofErr w:type="spellStart"/>
+      <w:r>
+        <w:rPr>
+          <w:b w:val="0"/>
+          <w:bCs w:val="0"/>
+          <w:color w:val="000000" w:themeColor="text1"/>
+          <w:sz w:val="22"/>
+          <w:szCs w:val="22"/>
+        </w:rPr>
+        <w:t>serverPool</w:t>
+      </w:r>
+      <w:proofErr w:type="spellEnd"/>
+      <w:r>
+        <w:rPr>
+          <w:b w:val="0"/>
+          <w:bCs w:val="0"/>
+          <w:color w:val="000000" w:themeColor="text1"/>
+          <w:sz w:val="22"/>
+          <w:szCs w:val="22"/>
+        </w:rPr>
+        <w:t xml:space="preserve"> e 62 na </w:t>
+      </w:r>
+      <w:proofErr w:type="spellStart"/>
+      <w:r>
+        <w:rPr>
+          <w:b w:val="0"/>
+          <w:bCs w:val="0"/>
+          <w:color w:val="000000" w:themeColor="text1"/>
+          <w:sz w:val="22"/>
+          <w:szCs w:val="22"/>
+        </w:rPr>
+        <w:t>QuiosquePool</w:t>
+      </w:r>
+      <w:proofErr w:type="spellEnd"/>
+      <w:r>
+        <w:rPr>
+          <w:b w:val="0"/>
+          <w:bCs w:val="0"/>
+          <w:color w:val="000000" w:themeColor="text1"/>
+          <w:sz w:val="22"/>
+          <w:szCs w:val="22"/>
+        </w:rPr>
+        <w:t>) refletindo com exatidão o remanescente de endereços dinâmicos disponíveis até ao final do respetivo bloco VLSM, mantendo a conformidade absoluta com os requisitos do enunciado.</w:t>
+      </w:r>
+    </w:p>
+    <w:p>
+      <w:pPr>
+        <w:pStyle w:val="Ttulo2"/>
+      </w:pPr>
+      <w:r>
+        <w:t>Covilhã (CVL-DHCP)</w:t>
+      </w:r>
+    </w:p>
+    <w:p>
+      <w:pPr>
+        <w:pStyle w:val="Ttulo2"/>
+        <w:jc w:val="both"/>
+        <w:rPr>
+          <w:b w:val="0"/>
+          <w:bCs w:val="0"/>
+          <w:color w:val="000000" w:themeColor="text1"/>
+          <w:sz w:val="22"/>
+          <w:szCs w:val="22"/>
+        </w:rPr>
+      </w:pPr>
+      <w:r>
+        <w:rPr>
+          <w:b w:val="0"/>
+          <w:bCs w:val="0"/>
+          <w:color w:val="000000" w:themeColor="text1"/>
+          <w:sz w:val="22"/>
+          <w:szCs w:val="22"/>
+        </w:rPr>
+        <w:t xml:space="preserve">Justificação do Dimensionamento das Pools DHCP na Covilhã: Na localidade da Covilhã, utilizou-se o endereço base 10.30.9.0/24, onde as sub-redes </w:t>
+      </w:r>
+      <w:proofErr w:type="spellStart"/>
+      <w:r>
+        <w:rPr>
+          <w:b w:val="0"/>
+          <w:bCs w:val="0"/>
+          <w:color w:val="000000" w:themeColor="text1"/>
+          <w:sz w:val="22"/>
+          <w:szCs w:val="22"/>
+        </w:rPr>
+        <w:t>Guest</w:t>
+      </w:r>
+      <w:proofErr w:type="spellEnd"/>
+      <w:r>
+        <w:rPr>
+          <w:b w:val="0"/>
+          <w:bCs w:val="0"/>
+          <w:color w:val="000000" w:themeColor="text1"/>
+          <w:sz w:val="22"/>
+          <w:szCs w:val="22"/>
+        </w:rPr>
+        <w:t xml:space="preserve"> e Management exigiram blocos /26 para acomodar a necessidade de 33 </w:t>
+      </w:r>
+      <w:proofErr w:type="spellStart"/>
+      <w:r>
+        <w:rPr>
+          <w:b w:val="0"/>
+          <w:bCs w:val="0"/>
+          <w:color w:val="000000" w:themeColor="text1"/>
+          <w:sz w:val="22"/>
+          <w:szCs w:val="22"/>
+        </w:rPr>
+        <w:t>hosts</w:t>
+      </w:r>
+      <w:proofErr w:type="spellEnd"/>
+      <w:r>
+        <w:rPr>
+          <w:b w:val="0"/>
+          <w:bCs w:val="0"/>
+          <w:color w:val="000000" w:themeColor="text1"/>
+          <w:sz w:val="22"/>
+          <w:szCs w:val="22"/>
+        </w:rPr>
+        <w:t xml:space="preserve">. À semelhança da metodologia aplicada em Aveiro, as pools configuradas no equipamento CVL-DHCP foram desenhadas para entregar apenas os endereços puramente dinâmicos. O </w:t>
+      </w:r>
+      <w:proofErr w:type="spellStart"/>
+      <w:r>
+        <w:rPr>
+          <w:b w:val="0"/>
+          <w:bCs w:val="0"/>
+          <w:i/>
+          <w:color w:val="000000" w:themeColor="text1"/>
+          <w:sz w:val="22"/>
+          <w:szCs w:val="22"/>
+        </w:rPr>
+        <w:t>Start</w:t>
+      </w:r>
+      <w:proofErr w:type="spellEnd"/>
+      <w:r>
+        <w:rPr>
+          <w:b w:val="0"/>
+          <w:bCs w:val="0"/>
+          <w:i/>
+          <w:color w:val="000000" w:themeColor="text1"/>
+          <w:sz w:val="22"/>
+          <w:szCs w:val="22"/>
+        </w:rPr>
+        <w:t xml:space="preserve"> IP </w:t>
+      </w:r>
+      <w:proofErr w:type="spellStart"/>
+      <w:r>
+        <w:rPr>
+          <w:b w:val="0"/>
+          <w:bCs w:val="0"/>
+          <w:i/>
+          <w:color w:val="000000" w:themeColor="text1"/>
+          <w:sz w:val="22"/>
+          <w:szCs w:val="22"/>
+        </w:rPr>
+        <w:t>Address</w:t>
+      </w:r>
+      <w:proofErr w:type="spellEnd"/>
+      <w:r>
+        <w:rPr>
+          <w:b w:val="0"/>
+          <w:bCs w:val="0"/>
+          <w:color w:val="000000" w:themeColor="text1"/>
+          <w:sz w:val="22"/>
+          <w:szCs w:val="22"/>
+        </w:rPr>
+        <w:t xml:space="preserve"> de cada âmbito foi configurado iniciando-se no </w:t>
+      </w:r>
+      <w:proofErr w:type="spellStart"/>
+      <w:r>
+        <w:rPr>
+          <w:b w:val="0"/>
+          <w:bCs w:val="0"/>
+          <w:color w:val="000000" w:themeColor="text1"/>
+          <w:sz w:val="22"/>
+          <w:szCs w:val="22"/>
+        </w:rPr>
+        <w:t>host</w:t>
+      </w:r>
+      <w:proofErr w:type="spellEnd"/>
+      <w:r>
+        <w:rPr>
+          <w:b w:val="0"/>
+          <w:bCs w:val="0"/>
+          <w:color w:val="000000" w:themeColor="text1"/>
+          <w:sz w:val="22"/>
+          <w:szCs w:val="22"/>
+        </w:rPr>
+        <w:t xml:space="preserve"> imediatamente a seguir ao Gateway padrão (</w:t>
+      </w:r>
+      <w:proofErr w:type="spellStart"/>
+      <w:r>
+        <w:rPr>
+          <w:b w:val="0"/>
+          <w:bCs w:val="0"/>
+          <w:color w:val="000000" w:themeColor="text1"/>
+          <w:sz w:val="22"/>
+          <w:szCs w:val="22"/>
+        </w:rPr>
+        <w:t>ex</w:t>
+      </w:r>
+      <w:proofErr w:type="spellEnd"/>
+      <w:r>
+        <w:rPr>
+          <w:b w:val="0"/>
+          <w:bCs w:val="0"/>
+          <w:color w:val="000000" w:themeColor="text1"/>
+          <w:sz w:val="22"/>
+          <w:szCs w:val="22"/>
+        </w:rPr>
+        <w:t xml:space="preserve">: 10.30.9.2 para a </w:t>
+      </w:r>
+      <w:proofErr w:type="spellStart"/>
+      <w:r>
+        <w:rPr>
+          <w:b w:val="0"/>
+          <w:bCs w:val="0"/>
+          <w:color w:val="000000" w:themeColor="text1"/>
+          <w:sz w:val="22"/>
+          <w:szCs w:val="22"/>
+        </w:rPr>
+        <w:t>GuestPool</w:t>
+      </w:r>
+      <w:proofErr w:type="spellEnd"/>
+      <w:r>
+        <w:rPr>
+          <w:b w:val="0"/>
+          <w:bCs w:val="0"/>
+          <w:color w:val="000000" w:themeColor="text1"/>
+          <w:sz w:val="22"/>
+          <w:szCs w:val="22"/>
+        </w:rPr>
+        <w:t xml:space="preserve"> e 10.30.9.66 para a </w:t>
+      </w:r>
+      <w:proofErr w:type="spellStart"/>
+      <w:r>
+        <w:rPr>
+          <w:b w:val="0"/>
+          <w:bCs w:val="0"/>
+          <w:color w:val="000000" w:themeColor="text1"/>
+          <w:sz w:val="22"/>
+          <w:szCs w:val="22"/>
+        </w:rPr>
+        <w:t>ManagmentPool</w:t>
+      </w:r>
+      <w:proofErr w:type="spellEnd"/>
+      <w:r>
+        <w:rPr>
+          <w:b w:val="0"/>
+          <w:bCs w:val="0"/>
+          <w:color w:val="000000" w:themeColor="text1"/>
+          <w:sz w:val="22"/>
+          <w:szCs w:val="22"/>
+        </w:rPr>
+        <w:t xml:space="preserve">). Na </w:t>
+      </w:r>
+      <w:proofErr w:type="spellStart"/>
+      <w:r>
+        <w:rPr>
+          <w:b w:val="0"/>
+          <w:bCs w:val="0"/>
+          <w:color w:val="000000" w:themeColor="text1"/>
+          <w:sz w:val="22"/>
+          <w:szCs w:val="22"/>
+        </w:rPr>
+        <w:t>serverPool</w:t>
+      </w:r>
+      <w:proofErr w:type="spellEnd"/>
+      <w:r>
+        <w:rPr>
+          <w:b w:val="0"/>
+          <w:bCs w:val="0"/>
+          <w:color w:val="000000" w:themeColor="text1"/>
+          <w:sz w:val="22"/>
+          <w:szCs w:val="22"/>
+        </w:rPr>
+        <w:t xml:space="preserve"> (VLAN 160), cujo intervalo teórico de </w:t>
+      </w:r>
+      <w:proofErr w:type="spellStart"/>
+      <w:r>
+        <w:rPr>
+          <w:b w:val="0"/>
+          <w:bCs w:val="0"/>
+          <w:color w:val="000000" w:themeColor="text1"/>
+          <w:sz w:val="22"/>
+          <w:szCs w:val="22"/>
+        </w:rPr>
+        <w:t>hosts</w:t>
+      </w:r>
+      <w:proofErr w:type="spellEnd"/>
+      <w:r>
+        <w:rPr>
+          <w:b w:val="0"/>
+          <w:bCs w:val="0"/>
+          <w:color w:val="000000" w:themeColor="text1"/>
+          <w:sz w:val="22"/>
+          <w:szCs w:val="22"/>
+        </w:rPr>
+        <w:t xml:space="preserve"> vai do .129 ao .190, o início da entrega dinâmica foi fixado em 10.30.9.138. Esta parametrização salvaguarda os endereços estáticos do Gateway (.129) e dos oito servidores de infraestrutura localmente presentes (CVL-DHCP, CVL-NTP, servidores WEB e bases de dados, do .130 ao .137) constantes na Tabela de Endereçamento IP. Na </w:t>
+      </w:r>
+      <w:proofErr w:type="spellStart"/>
+      <w:r>
+        <w:rPr>
+          <w:b w:val="0"/>
+          <w:bCs w:val="0"/>
+          <w:color w:val="000000" w:themeColor="text1"/>
+          <w:sz w:val="22"/>
+          <w:szCs w:val="22"/>
+        </w:rPr>
+        <w:t>PrintersPool</w:t>
+      </w:r>
+      <w:proofErr w:type="spellEnd"/>
+      <w:r>
+        <w:rPr>
+          <w:b w:val="0"/>
+          <w:bCs w:val="0"/>
+          <w:color w:val="000000" w:themeColor="text1"/>
+          <w:sz w:val="22"/>
+          <w:szCs w:val="22"/>
+        </w:rPr>
+        <w:t xml:space="preserve"> (VLAN 16), o início dinâmico foi fixado em 10.30.9.243 de forma a proteger a reserva estática da impressora CVL-P1 (.242) e do </w:t>
+      </w:r>
+      <w:proofErr w:type="spellStart"/>
+      <w:r>
+        <w:rPr>
+          <w:b w:val="0"/>
+          <w:bCs w:val="0"/>
+          <w:color w:val="000000" w:themeColor="text1"/>
+          <w:sz w:val="22"/>
+          <w:szCs w:val="22"/>
+        </w:rPr>
+        <w:t>gateway</w:t>
+      </w:r>
+      <w:proofErr w:type="spellEnd"/>
+      <w:r>
+        <w:rPr>
+          <w:b w:val="0"/>
+          <w:bCs w:val="0"/>
+          <w:color w:val="000000" w:themeColor="text1"/>
+          <w:sz w:val="22"/>
+          <w:szCs w:val="22"/>
+        </w:rPr>
+        <w:t xml:space="preserve"> (.241). O recálculo automático do </w:t>
+      </w:r>
+      <w:proofErr w:type="spellStart"/>
+      <w:r>
+        <w:rPr>
+          <w:b w:val="0"/>
+          <w:bCs w:val="0"/>
+          <w:color w:val="000000" w:themeColor="text1"/>
+          <w:sz w:val="22"/>
+          <w:szCs w:val="22"/>
+        </w:rPr>
+        <w:t>Packet</w:t>
+      </w:r>
+      <w:proofErr w:type="spellEnd"/>
+      <w:r>
+        <w:rPr>
+          <w:b w:val="0"/>
+          <w:bCs w:val="0"/>
+          <w:color w:val="000000" w:themeColor="text1"/>
+          <w:sz w:val="22"/>
+          <w:szCs w:val="22"/>
+        </w:rPr>
+        <w:t xml:space="preserve"> </w:t>
+      </w:r>
+      <w:proofErr w:type="spellStart"/>
+      <w:r>
+        <w:rPr>
+          <w:b w:val="0"/>
+          <w:bCs w:val="0"/>
+          <w:color w:val="000000" w:themeColor="text1"/>
+          <w:sz w:val="22"/>
+          <w:szCs w:val="22"/>
+        </w:rPr>
+        <w:t>Tracer</w:t>
+      </w:r>
+      <w:proofErr w:type="spellEnd"/>
+      <w:r>
+        <w:rPr>
+          <w:b w:val="0"/>
+          <w:bCs w:val="0"/>
+          <w:color w:val="000000" w:themeColor="text1"/>
+          <w:sz w:val="22"/>
+          <w:szCs w:val="22"/>
+        </w:rPr>
+        <w:t xml:space="preserve"> para o número máximo de utilizadores (como os 54 na </w:t>
+      </w:r>
+      <w:proofErr w:type="spellStart"/>
+      <w:r>
+        <w:rPr>
+          <w:b w:val="0"/>
+          <w:bCs w:val="0"/>
+          <w:color w:val="000000" w:themeColor="text1"/>
+          <w:sz w:val="22"/>
+          <w:szCs w:val="22"/>
+        </w:rPr>
+        <w:t>serverPool</w:t>
+      </w:r>
+      <w:proofErr w:type="spellEnd"/>
+      <w:r>
+        <w:rPr>
+          <w:b w:val="0"/>
+          <w:bCs w:val="0"/>
+          <w:color w:val="000000" w:themeColor="text1"/>
+          <w:sz w:val="22"/>
+          <w:szCs w:val="22"/>
+        </w:rPr>
+        <w:t xml:space="preserve"> e os 13 na </w:t>
+      </w:r>
+      <w:proofErr w:type="spellStart"/>
+      <w:r>
+        <w:rPr>
+          <w:b w:val="0"/>
+          <w:bCs w:val="0"/>
+          <w:color w:val="000000" w:themeColor="text1"/>
+          <w:sz w:val="22"/>
+          <w:szCs w:val="22"/>
+        </w:rPr>
+        <w:t>PrintersPool</w:t>
+      </w:r>
+      <w:proofErr w:type="spellEnd"/>
+      <w:r>
+        <w:rPr>
+          <w:b w:val="0"/>
+          <w:bCs w:val="0"/>
+          <w:color w:val="000000" w:themeColor="text1"/>
+          <w:sz w:val="22"/>
+          <w:szCs w:val="22"/>
+        </w:rPr>
+        <w:t xml:space="preserve">) espelha a quantidade exata de </w:t>
+      </w:r>
+      <w:proofErr w:type="spellStart"/>
+      <w:r>
+        <w:rPr>
+          <w:b w:val="0"/>
+          <w:bCs w:val="0"/>
+          <w:color w:val="000000" w:themeColor="text1"/>
+          <w:sz w:val="22"/>
+          <w:szCs w:val="22"/>
+        </w:rPr>
+        <w:t>IPs</w:t>
+      </w:r>
+      <w:proofErr w:type="spellEnd"/>
+      <w:r>
+        <w:rPr>
+          <w:b w:val="0"/>
+          <w:bCs w:val="0"/>
+          <w:color w:val="000000" w:themeColor="text1"/>
+          <w:sz w:val="22"/>
+          <w:szCs w:val="22"/>
+        </w:rPr>
+        <w:t xml:space="preserve"> que o servidor pode distribuir sem provocar sobreposições ou extravasar os limites de </w:t>
+      </w:r>
+      <w:proofErr w:type="spellStart"/>
+      <w:r>
+        <w:rPr>
+          <w:b w:val="0"/>
+          <w:bCs w:val="0"/>
+          <w:i/>
+          <w:color w:val="000000" w:themeColor="text1"/>
+          <w:sz w:val="22"/>
+          <w:szCs w:val="22"/>
+        </w:rPr>
+        <w:t>broadcast</w:t>
+      </w:r>
+      <w:proofErr w:type="spellEnd"/>
+      <w:r>
+        <w:rPr>
+          <w:b w:val="0"/>
+          <w:bCs w:val="0"/>
+          <w:color w:val="000000" w:themeColor="text1"/>
+          <w:sz w:val="22"/>
+          <w:szCs w:val="22"/>
+        </w:rPr>
+        <w:t xml:space="preserve"> ditados pelo planeamento VLSM.</w:t>
+      </w:r>
+    </w:p>
+    <w:p>
+      <w:pPr>
+        <w:pStyle w:val="Ttulo2"/>
+      </w:pPr>
+      <w:r>
+        <w:t>5.4. Configuração DNS e HTTP</w:t>
       </w:r>
     </w:p>
     <w:p>
@@ -11864,9 +15446,35 @@
           <w:sz w:val="22"/>
           <w:szCs w:val="22"/>
         </w:rPr>
-        <w:t xml:space="preserve">[A preencher — </w:t>
+        <w:t>[A preencher — servidor DNS (AVR-DNS), servidor HTTP (AVR-WEB), website betatest.aveiro.com]</w:t>
+      </w:r>
+    </w:p>
+    <w:p>
+      <w:pPr>
+        <w:pStyle w:val="Ttulo2"/>
+      </w:pPr>
+      <w:r>
+        <w:lastRenderedPageBreak/>
+        <w:t xml:space="preserve">5.5. Configuração </w:t>
       </w:r>
       <w:proofErr w:type="spellStart"/>
+      <w:r>
+        <w:t>VLANs</w:t>
+      </w:r>
+      <w:proofErr w:type="spellEnd"/>
+      <w:r>
+        <w:t xml:space="preserve"> e </w:t>
+      </w:r>
+      <w:proofErr w:type="spellStart"/>
+      <w:r>
+        <w:t>Trunk</w:t>
+      </w:r>
+      <w:proofErr w:type="spellEnd"/>
+    </w:p>
+    <w:p>
+      <w:pPr>
+        <w:spacing w:before="80" w:after="80"/>
+      </w:pPr>
       <w:r>
         <w:rPr>
           <w:i/>
@@ -11874,9 +15482,9 @@
           <w:sz w:val="22"/>
           <w:szCs w:val="22"/>
         </w:rPr>
-        <w:t>hostname</w:t>
-      </w:r>
-      <w:proofErr w:type="spellEnd"/>
+        <w:t xml:space="preserve">[A preencher — criação das </w:t>
+      </w:r>
+      <w:proofErr w:type="spellStart"/>
       <w:r>
         <w:rPr>
           <w:i/>
@@ -11884,9 +15492,9 @@
           <w:sz w:val="22"/>
           <w:szCs w:val="22"/>
         </w:rPr>
-        <w:t xml:space="preserve">, </w:t>
-      </w:r>
-      <w:proofErr w:type="spellStart"/>
+        <w:t>VLANs</w:t>
+      </w:r>
+      <w:proofErr w:type="spellEnd"/>
       <w:r>
         <w:rPr>
           <w:i/>
@@ -11894,9 +15502,9 @@
           <w:sz w:val="22"/>
           <w:szCs w:val="22"/>
         </w:rPr>
-        <w:t>banner</w:t>
-      </w:r>
-      <w:proofErr w:type="spellEnd"/>
+        <w:t xml:space="preserve"> nos </w:t>
+      </w:r>
+      <w:proofErr w:type="spellStart"/>
       <w:r>
         <w:rPr>
           <w:i/>
@@ -11904,21 +15512,9 @@
           <w:sz w:val="22"/>
           <w:szCs w:val="22"/>
         </w:rPr>
-        <w:t>, passwords, SSH, NTP, domínio, encriptação, portas desativadas, NVRAM]</w:t>
-      </w:r>
-    </w:p>
-    <w:p>
-      <w:pPr>
-        <w:pStyle w:val="Ttulo2"/>
-      </w:pPr>
-      <w:r>
-        <w:t>5.2. Configuração das Interfaces dos Routers</w:t>
-      </w:r>
-    </w:p>
-    <w:p>
-      <w:pPr>
-        <w:spacing w:before="80" w:after="80"/>
-      </w:pPr>
+        <w:t>switches</w:t>
+      </w:r>
+      <w:proofErr w:type="spellEnd"/>
       <w:r>
         <w:rPr>
           <w:i/>
@@ -11926,10 +15522,9 @@
           <w:sz w:val="22"/>
           <w:szCs w:val="22"/>
         </w:rPr>
-        <w:t xml:space="preserve">[A preencher — configuração das </w:t>
+        <w:t xml:space="preserve">, </w:t>
       </w:r>
       <w:proofErr w:type="spellStart"/>
-      <w:proofErr w:type="gramStart"/>
       <w:r>
         <w:rPr>
           <w:i/>
@@ -11937,10 +15532,9 @@
           <w:sz w:val="22"/>
           <w:szCs w:val="22"/>
         </w:rPr>
-        <w:t>sub-interfaces</w:t>
+        <w:t>trunk</w:t>
       </w:r>
       <w:proofErr w:type="spellEnd"/>
-      <w:proofErr w:type="gramEnd"/>
       <w:r>
         <w:rPr>
           <w:i/>
@@ -11948,21 +15542,9 @@
           <w:sz w:val="22"/>
           <w:szCs w:val="22"/>
         </w:rPr>
-        <w:t>, endereços IP, encapsulamento 802.1Q]</w:t>
-      </w:r>
-    </w:p>
-    <w:p>
-      <w:pPr>
-        <w:pStyle w:val="Ttulo2"/>
-      </w:pPr>
-      <w:r>
-        <w:t>5.3. Configuração do Servidor DHCP</w:t>
-      </w:r>
-    </w:p>
-    <w:p>
-      <w:pPr>
-        <w:spacing w:before="80" w:after="80"/>
-      </w:pPr>
+        <w:t xml:space="preserve"> entre </w:t>
+      </w:r>
+      <w:proofErr w:type="spellStart"/>
       <w:r>
         <w:rPr>
           <w:i/>
@@ -11970,21 +15552,9 @@
           <w:sz w:val="22"/>
           <w:szCs w:val="22"/>
         </w:rPr>
-        <w:t>[A preencher — pools DHCP para cada VLAN em Aveiro e Covilhã]</w:t>
-      </w:r>
-    </w:p>
-    <w:p>
-      <w:pPr>
-        <w:pStyle w:val="Ttulo2"/>
-      </w:pPr>
-      <w:r>
-        <w:t>5.4. Configuração DNS e HTTP</w:t>
-      </w:r>
-    </w:p>
-    <w:p>
-      <w:pPr>
-        <w:spacing w:before="80" w:after="80"/>
-      </w:pPr>
+        <w:t>switches</w:t>
+      </w:r>
+      <w:proofErr w:type="spellEnd"/>
       <w:r>
         <w:rPr>
           <w:i/>
@@ -11992,34 +15562,9 @@
           <w:sz w:val="22"/>
           <w:szCs w:val="22"/>
         </w:rPr>
-        <w:t>[A preencher — servidor DNS (AVR-DNS), servidor HTTP (AVR-WEB), website betatest.aveiro.com]</w:t>
-      </w:r>
-    </w:p>
-    <w:p>
-      <w:pPr>
-        <w:pStyle w:val="Ttulo2"/>
-      </w:pPr>
-      <w:r>
-        <w:t xml:space="preserve">5.5. Configuração </w:t>
+        <w:t xml:space="preserve"> e </w:t>
       </w:r>
       <w:proofErr w:type="spellStart"/>
-      <w:r>
-        <w:t>VLANs</w:t>
-      </w:r>
-      <w:proofErr w:type="spellEnd"/>
-      <w:r>
-        <w:t xml:space="preserve"> e </w:t>
-      </w:r>
-      <w:proofErr w:type="spellStart"/>
-      <w:r>
-        <w:t>Trunk</w:t>
-      </w:r>
-      <w:proofErr w:type="spellEnd"/>
-    </w:p>
-    <w:p>
-      <w:pPr>
-        <w:spacing w:before="80" w:after="80"/>
-      </w:pPr>
       <w:r>
         <w:rPr>
           <w:i/>
@@ -12027,9 +15572,9 @@
           <w:sz w:val="22"/>
           <w:szCs w:val="22"/>
         </w:rPr>
-        <w:t xml:space="preserve">[A preencher — criação das </w:t>
-      </w:r>
-      <w:proofErr w:type="spellStart"/>
+        <w:t>switch</w:t>
+      </w:r>
+      <w:proofErr w:type="spellEnd"/>
       <w:r>
         <w:rPr>
           <w:i/>
@@ -12037,9 +15582,29 @@
           <w:sz w:val="22"/>
           <w:szCs w:val="22"/>
         </w:rPr>
-        <w:t>VLANs</w:t>
+        <w:t>-router, VLAN de gestão 500]</w:t>
+      </w:r>
+    </w:p>
+    <w:p>
+      <w:pPr>
+        <w:pStyle w:val="Ttulo2"/>
+      </w:pPr>
+      <w:r>
+        <w:t>5.6. Agregação de Links (</w:t>
+      </w:r>
+      <w:proofErr w:type="spellStart"/>
+      <w:r>
+        <w:t>LaCP</w:t>
       </w:r>
       <w:proofErr w:type="spellEnd"/>
+      <w:r>
+        <w:t>)</w:t>
+      </w:r>
+    </w:p>
+    <w:p>
+      <w:pPr>
+        <w:spacing w:before="80" w:after="80"/>
+      </w:pPr>
       <w:r>
         <w:rPr>
           <w:i/>
@@ -12047,7 +15612,7 @@
           <w:sz w:val="22"/>
           <w:szCs w:val="22"/>
         </w:rPr>
-        <w:t xml:space="preserve"> nos </w:t>
+        <w:t xml:space="preserve">[A preencher — configuração do protocolo </w:t>
       </w:r>
       <w:proofErr w:type="spellStart"/>
       <w:r>
@@ -12057,7 +15622,7 @@
           <w:sz w:val="22"/>
           <w:szCs w:val="22"/>
         </w:rPr>
-        <w:t>switches</w:t>
+        <w:t>LaCP</w:t>
       </w:r>
       <w:proofErr w:type="spellEnd"/>
       <w:r>
@@ -12067,7 +15632,7 @@
           <w:sz w:val="22"/>
           <w:szCs w:val="22"/>
         </w:rPr>
-        <w:t xml:space="preserve">, </w:t>
+        <w:t xml:space="preserve"> entre </w:t>
       </w:r>
       <w:proofErr w:type="spellStart"/>
       <w:r>
@@ -12077,7 +15642,7 @@
           <w:sz w:val="22"/>
           <w:szCs w:val="22"/>
         </w:rPr>
-        <w:t>trunk</w:t>
+        <w:t>switches</w:t>
       </w:r>
       <w:proofErr w:type="spellEnd"/>
       <w:r>
@@ -12087,9 +15652,29 @@
           <w:sz w:val="22"/>
           <w:szCs w:val="22"/>
         </w:rPr>
-        <w:t xml:space="preserve"> entre </w:t>
+        <w:t>]</w:t>
+      </w:r>
+    </w:p>
+    <w:p>
+      <w:pPr>
+        <w:pStyle w:val="Ttulo2"/>
+      </w:pPr>
+      <w:r>
+        <w:t xml:space="preserve">5.7. </w:t>
       </w:r>
       <w:proofErr w:type="spellStart"/>
+      <w:r>
+        <w:t>Routing</w:t>
+      </w:r>
+      <w:proofErr w:type="spellEnd"/>
+      <w:r>
+        <w:t xml:space="preserve"> — RIP V2</w:t>
+      </w:r>
+    </w:p>
+    <w:p>
+      <w:pPr>
+        <w:spacing w:before="80" w:after="80"/>
+      </w:pPr>
       <w:r>
         <w:rPr>
           <w:i/>
@@ -12097,9 +15682,9 @@
           <w:sz w:val="22"/>
           <w:szCs w:val="22"/>
         </w:rPr>
-        <w:t>switches</w:t>
-      </w:r>
-      <w:proofErr w:type="spellEnd"/>
+        <w:t xml:space="preserve">[A preencher — configuração RIP V2 nos routers AVR e CVL, </w:t>
+      </w:r>
+      <w:proofErr w:type="spellStart"/>
       <w:r>
         <w:rPr>
           <w:i/>
@@ -12107,9 +15692,9 @@
           <w:sz w:val="22"/>
           <w:szCs w:val="22"/>
         </w:rPr>
-        <w:t xml:space="preserve"> e </w:t>
-      </w:r>
-      <w:proofErr w:type="spellStart"/>
+        <w:t>default-route</w:t>
+      </w:r>
+      <w:proofErr w:type="spellEnd"/>
       <w:r>
         <w:rPr>
           <w:i/>
@@ -12117,9 +15702,26 @@
           <w:sz w:val="22"/>
           <w:szCs w:val="22"/>
         </w:rPr>
-        <w:t>switch</w:t>
+        <w:t xml:space="preserve"> para ISP]</w:t>
+      </w:r>
+    </w:p>
+    <w:p>
+      <w:pPr>
+        <w:pStyle w:val="Ttulo2"/>
+      </w:pPr>
+      <w:r>
+        <w:t xml:space="preserve">5.8. NAT </w:t>
+      </w:r>
+      <w:proofErr w:type="spellStart"/>
+      <w:r>
+        <w:t>Overload</w:t>
       </w:r>
       <w:proofErr w:type="spellEnd"/>
+    </w:p>
+    <w:p>
+      <w:pPr>
+        <w:spacing w:before="80" w:after="80"/>
+      </w:pPr>
       <w:r>
         <w:rPr>
           <w:i/>
@@ -12127,29 +15729,9 @@
           <w:sz w:val="22"/>
           <w:szCs w:val="22"/>
         </w:rPr>
-        <w:t>-router, VLAN de gestão 500]</w:t>
-      </w:r>
-    </w:p>
-    <w:p>
-      <w:pPr>
-        <w:pStyle w:val="Ttulo2"/>
-      </w:pPr>
-      <w:r>
-        <w:t>5.6. Agregação de Links (</w:t>
+        <w:t xml:space="preserve">[A preencher — configuração NAT </w:t>
       </w:r>
       <w:proofErr w:type="spellStart"/>
-      <w:r>
-        <w:t>LaCP</w:t>
-      </w:r>
-      <w:proofErr w:type="spellEnd"/>
-      <w:r>
-        <w:t>)</w:t>
-      </w:r>
-    </w:p>
-    <w:p>
-      <w:pPr>
-        <w:spacing w:before="80" w:after="80"/>
-      </w:pPr>
       <w:r>
         <w:rPr>
           <w:i/>
@@ -12157,9 +15739,9 @@
           <w:sz w:val="22"/>
           <w:szCs w:val="22"/>
         </w:rPr>
-        <w:t xml:space="preserve">[A preencher — configuração do protocolo </w:t>
-      </w:r>
-      <w:proofErr w:type="spellStart"/>
+        <w:t>overload</w:t>
+      </w:r>
+      <w:proofErr w:type="spellEnd"/>
       <w:r>
         <w:rPr>
           <w:i/>
@@ -12167,9 +15749,21 @@
           <w:sz w:val="22"/>
           <w:szCs w:val="22"/>
         </w:rPr>
-        <w:t>LaCP</w:t>
-      </w:r>
-      <w:proofErr w:type="spellEnd"/>
+        <w:t xml:space="preserve"> (PAT) nos routers para acesso à internet]</w:t>
+      </w:r>
+    </w:p>
+    <w:p>
+      <w:pPr>
+        <w:pStyle w:val="Ttulo2"/>
+      </w:pPr>
+      <w:r>
+        <w:t>5.9. Testes e Resultados</w:t>
+      </w:r>
+    </w:p>
+    <w:p>
+      <w:pPr>
+        <w:spacing w:before="80" w:after="80"/>
+      </w:pPr>
       <w:r>
         <w:rPr>
           <w:i/>
@@ -12177,7 +15771,7 @@
           <w:sz w:val="22"/>
           <w:szCs w:val="22"/>
         </w:rPr>
-        <w:t xml:space="preserve"> entre </w:t>
+        <w:t xml:space="preserve">[A preencher — </w:t>
       </w:r>
       <w:proofErr w:type="spellStart"/>
       <w:r>
@@ -12187,7 +15781,7 @@
           <w:sz w:val="22"/>
           <w:szCs w:val="22"/>
         </w:rPr>
-        <w:t>switches</w:t>
+        <w:t>ping</w:t>
       </w:r>
       <w:proofErr w:type="spellEnd"/>
       <w:r>
@@ -12197,29 +15791,9 @@
           <w:sz w:val="22"/>
           <w:szCs w:val="22"/>
         </w:rPr>
-        <w:t>]</w:t>
-      </w:r>
-    </w:p>
-    <w:p>
-      <w:pPr>
-        <w:pStyle w:val="Ttulo2"/>
-      </w:pPr>
-      <w:r>
-        <w:t xml:space="preserve">5.7. </w:t>
+        <w:t xml:space="preserve"> entre </w:t>
       </w:r>
       <w:proofErr w:type="spellStart"/>
-      <w:r>
-        <w:t>Routing</w:t>
-      </w:r>
-      <w:proofErr w:type="spellEnd"/>
-      <w:r>
-        <w:t xml:space="preserve"> — RIP V2</w:t>
-      </w:r>
-    </w:p>
-    <w:p>
-      <w:pPr>
-        <w:spacing w:before="80" w:after="80"/>
-      </w:pPr>
       <w:r>
         <w:rPr>
           <w:i/>
@@ -12227,9 +15801,9 @@
           <w:sz w:val="22"/>
           <w:szCs w:val="22"/>
         </w:rPr>
-        <w:t xml:space="preserve">[A preencher — configuração RIP V2 nos routers AVR e CVL, </w:t>
-      </w:r>
-      <w:proofErr w:type="spellStart"/>
+        <w:t>hosts</w:t>
+      </w:r>
+      <w:proofErr w:type="spellEnd"/>
       <w:r>
         <w:rPr>
           <w:i/>
@@ -12237,125 +15811,6 @@
           <w:sz w:val="22"/>
           <w:szCs w:val="22"/>
         </w:rPr>
-        <w:t>default-route</w:t>
-      </w:r>
-      <w:proofErr w:type="spellEnd"/>
-      <w:r>
-        <w:rPr>
-          <w:i/>
-          <w:color w:val="AAAAAA"/>
-          <w:sz w:val="22"/>
-          <w:szCs w:val="22"/>
-        </w:rPr>
-        <w:t xml:space="preserve"> para ISP]</w:t>
-      </w:r>
-    </w:p>
-    <w:p>
-      <w:pPr>
-        <w:pStyle w:val="Ttulo2"/>
-      </w:pPr>
-      <w:r>
-        <w:t xml:space="preserve">5.8. NAT </w:t>
-      </w:r>
-      <w:proofErr w:type="spellStart"/>
-      <w:r>
-        <w:t>Overload</w:t>
-      </w:r>
-      <w:proofErr w:type="spellEnd"/>
-    </w:p>
-    <w:p>
-      <w:pPr>
-        <w:spacing w:before="80" w:after="80"/>
-      </w:pPr>
-      <w:r>
-        <w:rPr>
-          <w:i/>
-          <w:color w:val="AAAAAA"/>
-          <w:sz w:val="22"/>
-          <w:szCs w:val="22"/>
-        </w:rPr>
-        <w:t xml:space="preserve">[A preencher — configuração NAT </w:t>
-      </w:r>
-      <w:proofErr w:type="spellStart"/>
-      <w:r>
-        <w:rPr>
-          <w:i/>
-          <w:color w:val="AAAAAA"/>
-          <w:sz w:val="22"/>
-          <w:szCs w:val="22"/>
-        </w:rPr>
-        <w:t>overload</w:t>
-      </w:r>
-      <w:proofErr w:type="spellEnd"/>
-      <w:r>
-        <w:rPr>
-          <w:i/>
-          <w:color w:val="AAAAAA"/>
-          <w:sz w:val="22"/>
-          <w:szCs w:val="22"/>
-        </w:rPr>
-        <w:t xml:space="preserve"> (PAT) nos routers para acesso à internet]</w:t>
-      </w:r>
-    </w:p>
-    <w:p>
-      <w:pPr>
-        <w:pStyle w:val="Ttulo2"/>
-      </w:pPr>
-      <w:r>
-        <w:t>5.9. Testes e Resultados</w:t>
-      </w:r>
-    </w:p>
-    <w:p>
-      <w:pPr>
-        <w:spacing w:before="80" w:after="80"/>
-      </w:pPr>
-      <w:r>
-        <w:rPr>
-          <w:i/>
-          <w:color w:val="AAAAAA"/>
-          <w:sz w:val="22"/>
-          <w:szCs w:val="22"/>
-        </w:rPr>
-        <w:t xml:space="preserve">[A preencher — </w:t>
-      </w:r>
-      <w:proofErr w:type="spellStart"/>
-      <w:r>
-        <w:rPr>
-          <w:i/>
-          <w:color w:val="AAAAAA"/>
-          <w:sz w:val="22"/>
-          <w:szCs w:val="22"/>
-        </w:rPr>
-        <w:t>ping</w:t>
-      </w:r>
-      <w:proofErr w:type="spellEnd"/>
-      <w:r>
-        <w:rPr>
-          <w:i/>
-          <w:color w:val="AAAAAA"/>
-          <w:sz w:val="22"/>
-          <w:szCs w:val="22"/>
-        </w:rPr>
-        <w:t xml:space="preserve"> entre </w:t>
-      </w:r>
-      <w:proofErr w:type="spellStart"/>
-      <w:r>
-        <w:rPr>
-          <w:i/>
-          <w:color w:val="AAAAAA"/>
-          <w:sz w:val="22"/>
-          <w:szCs w:val="22"/>
-        </w:rPr>
-        <w:t>hosts</w:t>
-      </w:r>
-      <w:proofErr w:type="spellEnd"/>
-      <w:r>
-        <w:rPr>
-          <w:i/>
-          <w:color w:val="AAAAAA"/>
-          <w:sz w:val="22"/>
-          <w:szCs w:val="22"/>
-        </w:rPr>
         <w:t>, acesso ao website, testes de conectividade entre Aveiro e Covilhã, NAT, DHCP]</w:t>
       </w:r>
     </w:p>
@@ -12394,59 +15849,65 @@
         <w:pStyle w:val="Ttulo1"/>
       </w:pPr>
       <w:r>
+        <w:t>4. Conclusão</w:t>
+      </w:r>
+    </w:p>
+    <w:p>
+      <w:pPr>
+        <w:spacing w:before="100" w:after="100"/>
+      </w:pPr>
+      <w:r>
+        <w:rPr>
+          <w:color w:val="000000"/>
+        </w:rPr>
+        <w:t>A primeira fase do projeto prático foi concluída com sucesso. Conseguimos planear e dimensionar o endereçamento IP para as duas localizações — Aveiro e Covilhã — utilizando corretamente a técnica VLSM, respeitando os requisitos de hosts definidos no enunciado e evitando o desperdício desnecessário de endereços.</w:t>
+      </w:r>
+    </w:p>
+    <w:p>
+      <w:pPr>
+        <w:spacing w:before="60" w:after="100"/>
+      </w:pPr>
+      <w:r>
+        <w:rPr>
+          <w:color w:val="000000"/>
+        </w:rPr>
+        <w:t>Em Aveiro (10.99.9.0/24) foram criadas 6 sub-redes, utilizando 192 dos 256 endereços disponíveis, ficando 64 endereços em reserva para expansão futura. Em Covilhã (10.30.9.0/24) foram igualmente criadas 6 sub-redes, utilizando 224 dos 256 endereços.</w:t>
+      </w:r>
+    </w:p>
+    <w:p>
+      <w:pPr>
+        <w:spacing w:before="60" w:after="100"/>
+      </w:pPr>
+      <w:r>
+        <w:rPr>
+          <w:color w:val="000000"/>
+        </w:rPr>
+        <w:t>As principais dificuldades encontradas prenderam-se com a ordenação correta das sub-redes por número de hosts e com a verificação de que os blocos atribuídos não se sobrepunham. Estas dificuldades foram ultrapassadas seguindo rigorosamente o algoritmo VLSM e validando cada sub-rede calculada.</w:t>
+      </w:r>
+    </w:p>
+    <w:p>
+      <w:pPr>
+        <w:spacing w:before="60" w:after="100"/>
+      </w:pPr>
+      <w:r>
+        <w:rPr>
+          <w:color w:val="000000"/>
+        </w:rPr>
+        <w:t xml:space="preserve">A topologia física foi igualmente construída no Packet Tracer, com todas as ligações entre os equipamentos representados na Figura 1 do enunciado. </w:t>
+      </w:r>
+      <w:r>
+        <w:rPr>
+          <w:color w:val="000000"/>
+        </w:rPr>
+        <w:br/>
+        <w:t xml:space="preserve">Logo estamos preparados para avançar para a segunda fase, que contemplará a </w:t>
+      </w:r>
+      <w:r>
+        <w:rPr>
+          <w:color w:val="000000"/>
+        </w:rPr>
         <w:lastRenderedPageBreak/>
-        <w:t>4. Conclusão</w:t>
-      </w:r>
-    </w:p>
-    <w:p>
-      <w:pPr>
-        <w:spacing w:before="100" w:after="100"/>
-      </w:pPr>
-      <w:r>
-        <w:rPr>
-          <w:color w:val="000000"/>
-        </w:rPr>
-        <w:t>A primeira fase do projeto prático foi concluída com sucesso. Conseguimos planear e dimensionar o endereçamento IP para as duas localizações — Aveiro e Covilhã — utilizando corretamente a técnica VLSM, respeitando os requisitos de hosts definidos no enunciado e evitando o desperdício desnecessário de endereços.</w:t>
-      </w:r>
-    </w:p>
-    <w:p>
-      <w:pPr>
-        <w:spacing w:before="60" w:after="100"/>
-      </w:pPr>
-      <w:r>
-        <w:rPr>
-          <w:color w:val="000000"/>
-        </w:rPr>
-        <w:t>Em Aveiro (10.99.9.0/24) foram criadas 6 sub-redes, utilizando 192 dos 256 endereços disponíveis, ficando 64 endereços em reserva para expansão futura. Em Covilhã (10.30.9.0/24) foram igualmente criadas 6 sub-redes, utilizando 224 dos 256 endereços.</w:t>
-      </w:r>
-    </w:p>
-    <w:p>
-      <w:pPr>
-        <w:spacing w:before="60" w:after="100"/>
-      </w:pPr>
-      <w:r>
-        <w:rPr>
-          <w:color w:val="000000"/>
-        </w:rPr>
-        <w:t>As principais dificuldades encontradas prenderam-se com a ordenação correta das sub-redes por número de hosts e com a verificação de que os blocos atribuídos não se sobrepunham. Estas dificuldades foram ultrapassadas seguindo rigorosamente o algoritmo VLSM e validando cada sub-rede calculada.</w:t>
-      </w:r>
-    </w:p>
-    <w:p>
-      <w:pPr>
-        <w:spacing w:before="60" w:after="100"/>
-      </w:pPr>
-      <w:r>
-        <w:rPr>
-          <w:color w:val="000000"/>
-        </w:rPr>
-        <w:t xml:space="preserve">A topologia física foi igualmente construída no Packet Tracer, com todas as ligações entre os equipamentos representados na Figura 1 do enunciado. </w:t>
-      </w:r>
-      <w:r>
-        <w:rPr>
-          <w:color w:val="000000"/>
-        </w:rPr>
-        <w:br/>
-        <w:t>Logo estamos preparados para avançar para a segunda fase, que contemplará a configuração completa de todos os equipamentos de rede.</w:t>
+        <w:t>configuração completa de todos os equipamentos de rede.</w:t>
       </w:r>
       <w:r>
         <w:rPr>
@@ -12457,8 +15918,8 @@
     </w:p>
     <w:p/>
     <w:sectPr>
-      <w:headerReference w:type="default" r:id="rId9"/>
-      <w:footerReference w:type="default" r:id="rId10"/>
+      <w:headerReference w:type="default" r:id="rId14"/>
+      <w:footerReference w:type="default" r:id="rId15"/>
       <w:pgSz w:w="11906" w:h="16838"/>
       <w:pgMar w:top="1440" w:right="1080" w:bottom="1440" w:left="1080" w:header="708" w:footer="708" w:gutter="0"/>
       <w:cols w:space="720"/>
@@ -12726,6 +16187,119 @@
       </w:pPr>
     </w:lvl>
   </w:abstractNum>
+  <w:abstractNum w:abstractNumId="2" w15:restartNumberingAfterBreak="0">
+    <w:nsid w:val="6B296311"/>
+    <w:multiLevelType w:val="multilevel"/>
+    <w:tmpl w:val="7E46B312"/>
+    <w:lvl w:ilvl="0">
+      <w:start w:val="1"/>
+      <w:numFmt w:val="decimal"/>
+      <w:lvlText w:val="%1."/>
+      <w:lvlJc w:val="left"/>
+      <w:pPr>
+        <w:tabs>
+          <w:tab w:val="num" w:pos="720"/>
+        </w:tabs>
+        <w:ind w:left="720" w:hanging="360"/>
+      </w:pPr>
+    </w:lvl>
+    <w:lvl w:ilvl="1" w:tentative="1">
+      <w:start w:val="1"/>
+      <w:numFmt w:val="decimal"/>
+      <w:lvlText w:val="%2."/>
+      <w:lvlJc w:val="left"/>
+      <w:pPr>
+        <w:tabs>
+          <w:tab w:val="num" w:pos="1440"/>
+        </w:tabs>
+        <w:ind w:left="1440" w:hanging="360"/>
+      </w:pPr>
+    </w:lvl>
+    <w:lvl w:ilvl="2" w:tentative="1">
+      <w:start w:val="1"/>
+      <w:numFmt w:val="decimal"/>
+      <w:lvlText w:val="%3."/>
+      <w:lvlJc w:val="left"/>
+      <w:pPr>
+        <w:tabs>
+          <w:tab w:val="num" w:pos="2160"/>
+        </w:tabs>
+        <w:ind w:left="2160" w:hanging="360"/>
+      </w:pPr>
+    </w:lvl>
+    <w:lvl w:ilvl="3" w:tentative="1">
+      <w:start w:val="1"/>
+      <w:numFmt w:val="decimal"/>
+      <w:lvlText w:val="%4."/>
+      <w:lvlJc w:val="left"/>
+      <w:pPr>
+        <w:tabs>
+          <w:tab w:val="num" w:pos="2880"/>
+        </w:tabs>
+        <w:ind w:left="2880" w:hanging="360"/>
+      </w:pPr>
+    </w:lvl>
+    <w:lvl w:ilvl="4" w:tentative="1">
+      <w:start w:val="1"/>
+      <w:numFmt w:val="decimal"/>
+      <w:lvlText w:val="%5."/>
+      <w:lvlJc w:val="left"/>
+      <w:pPr>
+        <w:tabs>
+          <w:tab w:val="num" w:pos="3600"/>
+        </w:tabs>
+        <w:ind w:left="3600" w:hanging="360"/>
+      </w:pPr>
+    </w:lvl>
+    <w:lvl w:ilvl="5" w:tentative="1">
+      <w:start w:val="1"/>
+      <w:numFmt w:val="decimal"/>
+      <w:lvlText w:val="%6."/>
+      <w:lvlJc w:val="left"/>
+      <w:pPr>
+        <w:tabs>
+          <w:tab w:val="num" w:pos="4320"/>
+        </w:tabs>
+        <w:ind w:left="4320" w:hanging="360"/>
+      </w:pPr>
+    </w:lvl>
+    <w:lvl w:ilvl="6" w:tentative="1">
+      <w:start w:val="1"/>
+      <w:numFmt w:val="decimal"/>
+      <w:lvlText w:val="%7."/>
+      <w:lvlJc w:val="left"/>
+      <w:pPr>
+        <w:tabs>
+          <w:tab w:val="num" w:pos="5040"/>
+        </w:tabs>
+        <w:ind w:left="5040" w:hanging="360"/>
+      </w:pPr>
+    </w:lvl>
+    <w:lvl w:ilvl="7" w:tentative="1">
+      <w:start w:val="1"/>
+      <w:numFmt w:val="decimal"/>
+      <w:lvlText w:val="%8."/>
+      <w:lvlJc w:val="left"/>
+      <w:pPr>
+        <w:tabs>
+          <w:tab w:val="num" w:pos="5760"/>
+        </w:tabs>
+        <w:ind w:left="5760" w:hanging="360"/>
+      </w:pPr>
+    </w:lvl>
+    <w:lvl w:ilvl="8" w:tentative="1">
+      <w:start w:val="1"/>
+      <w:numFmt w:val="decimal"/>
+      <w:lvlText w:val="%9."/>
+      <w:lvlJc w:val="left"/>
+      <w:pPr>
+        <w:tabs>
+          <w:tab w:val="num" w:pos="6480"/>
+        </w:tabs>
+        <w:ind w:left="6480" w:hanging="360"/>
+      </w:pPr>
+    </w:lvl>
+  </w:abstractNum>
   <w:num w:numId="1" w16cid:durableId="1420909169">
     <w:abstractNumId w:val="1"/>
     <w:lvlOverride w:ilvl="0">
@@ -12737,6 +16311,9 @@
     <w:lvlOverride w:ilvl="0">
       <w:startOverride w:val="1"/>
     </w:lvlOverride>
+  </w:num>
+  <w:num w:numId="3" w16cid:durableId="865295616">
+    <w:abstractNumId w:val="2"/>
   </w:num>
 </w:numbering>
 </file>
@@ -13231,7 +16808,6 @@
   <w:style w:type="character" w:default="1" w:styleId="Tipodeletrapredefinidodopargrafo">
     <w:name w:val="Default Paragraph Font"/>
     <w:uiPriority w:val="1"/>
-    <w:semiHidden/>
     <w:unhideWhenUsed/>
   </w:style>
   <w:style w:type="table" w:default="1" w:styleId="Tabelanormal">

</xml_diff>